<commit_message>
Multi-threading Interview Questions updated
</commit_message>
<xml_diff>
--- a/Interview Questions/6. Multithreading Questions.docx
+++ b/Interview Questions/6. Multithreading Questions.docx
@@ -38,10 +38,7 @@
         <w:t>Interview Questions</w:t>
       </w:r>
     </w:p>
-    <w:p>
-      <w:bookmarkStart w:id="0" w:name="_GoBack"/>
-      <w:bookmarkEnd w:id="0"/>
-    </w:p>
+    <w:p/>
     <w:p>
       <w:pPr>
         <w:rPr>
@@ -730,7 +727,7 @@
           <w:u w:val="single"/>
         </w:rPr>
       </w:pPr>
-      <w:bookmarkStart w:id="1" w:name="_Toc240881060"/>
+      <w:bookmarkStart w:id="0" w:name="_Toc240881060"/>
       <w:r>
         <w:rPr>
           <w:rFonts w:ascii="Comic Sans MS" w:hAnsi="Comic Sans MS"/>
@@ -752,7 +749,7 @@
         </w:rPr>
         <w:t xml:space="preserve"> Fundamentals</w:t>
       </w:r>
-      <w:bookmarkEnd w:id="1"/>
+      <w:bookmarkEnd w:id="0"/>
     </w:p>
     <w:p>
       <w:pPr>
@@ -797,8 +794,8 @@
           <w:lang w:eastAsia="en-IN"/>
         </w:rPr>
       </w:pPr>
-      <w:bookmarkStart w:id="2" w:name="_Toc240450089"/>
-      <w:bookmarkStart w:id="3" w:name="_Toc240881061"/>
+      <w:bookmarkStart w:id="1" w:name="_Toc240450089"/>
+      <w:bookmarkStart w:id="2" w:name="_Toc240881061"/>
       <w:r>
         <w:rPr>
           <w:rFonts w:ascii="Comic Sans MS" w:hAnsi="Comic Sans MS" w:cs="Segoe UI Symbol"/>
@@ -813,7 +810,7 @@
         </w:rPr>
         <w:t xml:space="preserve">. </w:t>
       </w:r>
-      <w:bookmarkEnd w:id="2"/>
+      <w:bookmarkEnd w:id="1"/>
       <w:r>
         <w:rPr>
           <w:rFonts w:ascii="Comic Sans MS" w:hAnsi="Comic Sans MS" w:cs="Segoe UI Symbol"/>
@@ -821,7 +818,7 @@
         </w:rPr>
         <w:t>What are differences between threads and processes?</w:t>
       </w:r>
-      <w:bookmarkEnd w:id="3"/>
+      <w:bookmarkEnd w:id="2"/>
     </w:p>
     <w:p>
       <w:pPr>
@@ -1801,44 +1798,30 @@
           <w:lang w:eastAsia="en-IN"/>
         </w:rPr>
       </w:pPr>
-      <w:bookmarkStart w:id="4" w:name="_Toc240881062"/>
+      <w:bookmarkStart w:id="3" w:name="_Toc240881062"/>
       <w:r>
         <w:rPr>
           <w:rFonts w:ascii="Comic Sans MS" w:hAnsi="Comic Sans MS" w:cs="Segoe UI Symbol"/>
           <w:sz w:val="28"/>
         </w:rPr>
         <w:lastRenderedPageBreak/>
-        <w:t>Q</w:t>
+        <w:t>Q2</w:t>
       </w:r>
       <w:r>
         <w:rPr>
           <w:rFonts w:ascii="Comic Sans MS" w:hAnsi="Comic Sans MS" w:cs="Segoe UI Symbol"/>
           <w:sz w:val="28"/>
         </w:rPr>
-        <w:t>2</w:t>
+        <w:t xml:space="preserve">. </w:t>
       </w:r>
       <w:r>
         <w:rPr>
           <w:rFonts w:ascii="Comic Sans MS" w:hAnsi="Comic Sans MS" w:cs="Segoe UI Symbol"/>
           <w:sz w:val="28"/>
         </w:rPr>
-        <w:t xml:space="preserve">. </w:t>
-      </w:r>
-      <w:r>
-        <w:rPr>
-          <w:rFonts w:ascii="Comic Sans MS" w:hAnsi="Comic Sans MS" w:cs="Segoe UI Symbol"/>
-          <w:sz w:val="28"/>
-        </w:rPr>
-        <w:t xml:space="preserve">What are </w:t>
-      </w:r>
-      <w:r>
-        <w:rPr>
-          <w:rFonts w:ascii="Comic Sans MS" w:hAnsi="Comic Sans MS" w:cs="Segoe UI Symbol"/>
-          <w:sz w:val="28"/>
-        </w:rPr>
-        <w:t>disadvantages of using multithreading?</w:t>
-      </w:r>
-      <w:bookmarkEnd w:id="4"/>
+        <w:t>What are disadvantages of using multithreading?</w:t>
+      </w:r>
+      <w:bookmarkEnd w:id="3"/>
     </w:p>
     <w:tbl>
       <w:tblPr>
@@ -2787,175 +2770,147 @@
           <w:lang w:eastAsia="en-IN"/>
         </w:rPr>
       </w:pPr>
-      <w:bookmarkStart w:id="5" w:name="_Toc240881063"/>
+      <w:bookmarkStart w:id="4" w:name="_Toc240881063"/>
       <w:r>
         <w:rPr>
           <w:rFonts w:ascii="Comic Sans MS" w:hAnsi="Comic Sans MS" w:cs="Segoe UI Symbol"/>
           <w:sz w:val="28"/>
         </w:rPr>
-        <w:t>Q</w:t>
+        <w:t>Q3</w:t>
       </w:r>
       <w:r>
         <w:rPr>
           <w:rFonts w:ascii="Comic Sans MS" w:hAnsi="Comic Sans MS" w:cs="Segoe UI Symbol"/>
           <w:sz w:val="28"/>
         </w:rPr>
-        <w:t>3</w:t>
+        <w:t xml:space="preserve">. </w:t>
       </w:r>
       <w:r>
         <w:rPr>
           <w:rFonts w:ascii="Comic Sans MS" w:hAnsi="Comic Sans MS" w:cs="Segoe UI Symbol"/>
           <w:sz w:val="28"/>
         </w:rPr>
-        <w:t xml:space="preserve">. </w:t>
-      </w:r>
+        <w:t>What is difference between multithreading and multitasking?</w:t>
+      </w:r>
+      <w:bookmarkEnd w:id="4"/>
+    </w:p>
+    <w:p>
+      <w:pPr>
+        <w:spacing w:after="0" w:line="240" w:lineRule="auto"/>
+        <w:rPr>
+          <w:rFonts w:ascii="Comic Sans MS" w:eastAsia="Times New Roman" w:hAnsi="Comic Sans MS" w:cstheme="majorHAnsi"/>
+          <w:bCs/>
+          <w:sz w:val="24"/>
+          <w:szCs w:val="24"/>
+          <w:lang w:eastAsia="en-IN"/>
+        </w:rPr>
+      </w:pPr>
+      <w:r>
+        <w:rPr>
+          <w:rFonts w:ascii="Comic Sans MS" w:eastAsia="Times New Roman" w:hAnsi="Comic Sans MS" w:cstheme="majorHAnsi"/>
+          <w:bCs/>
+          <w:sz w:val="24"/>
+          <w:szCs w:val="24"/>
+          <w:lang w:eastAsia="en-IN"/>
+        </w:rPr>
+        <w:t>Multithreading refers to running multiple threads within a single process, while multitasking refers to running multiple independent processes concurrently. Threads share the same memory space, whereas processes have separate memory spaces.</w:t>
+      </w:r>
+    </w:p>
+    <w:p>
+      <w:pPr>
+        <w:spacing w:after="0" w:line="240" w:lineRule="auto"/>
+        <w:rPr>
+          <w:rFonts w:ascii="Comic Sans MS" w:eastAsia="Times New Roman" w:hAnsi="Comic Sans MS" w:cstheme="majorHAnsi"/>
+          <w:bCs/>
+          <w:sz w:val="24"/>
+          <w:szCs w:val="24"/>
+          <w:lang w:eastAsia="en-IN"/>
+        </w:rPr>
+      </w:pPr>
+    </w:p>
+    <w:p>
+      <w:pPr>
+        <w:spacing w:after="0" w:line="240" w:lineRule="auto"/>
+        <w:rPr>
+          <w:rFonts w:ascii="Comic Sans MS" w:eastAsia="Times New Roman" w:hAnsi="Comic Sans MS" w:cstheme="majorHAnsi"/>
+          <w:bCs/>
+          <w:sz w:val="24"/>
+          <w:szCs w:val="24"/>
+          <w:lang w:eastAsia="en-IN"/>
+        </w:rPr>
+      </w:pPr>
+    </w:p>
+    <w:p>
+      <w:pPr>
+        <w:spacing w:after="0" w:line="240" w:lineRule="auto"/>
+        <w:rPr>
+          <w:rFonts w:ascii="Comic Sans MS" w:eastAsia="Times New Roman" w:hAnsi="Comic Sans MS" w:cstheme="majorHAnsi"/>
+          <w:bCs/>
+          <w:sz w:val="24"/>
+          <w:szCs w:val="24"/>
+          <w:lang w:eastAsia="en-IN"/>
+        </w:rPr>
+      </w:pPr>
+    </w:p>
+    <w:p>
+      <w:pPr>
+        <w:spacing w:after="0" w:line="240" w:lineRule="auto"/>
+        <w:rPr>
+          <w:rFonts w:ascii="Comic Sans MS" w:eastAsia="Times New Roman" w:hAnsi="Comic Sans MS" w:cstheme="majorHAnsi"/>
+          <w:bCs/>
+          <w:sz w:val="24"/>
+          <w:szCs w:val="24"/>
+          <w:lang w:eastAsia="en-IN"/>
+        </w:rPr>
+      </w:pPr>
+    </w:p>
+    <w:p>
+      <w:pPr>
+        <w:spacing w:after="0" w:line="240" w:lineRule="auto"/>
+        <w:rPr>
+          <w:rFonts w:ascii="Comic Sans MS" w:eastAsia="Times New Roman" w:hAnsi="Comic Sans MS" w:cstheme="majorHAnsi"/>
+          <w:bCs/>
+          <w:sz w:val="14"/>
+          <w:szCs w:val="24"/>
+          <w:lang w:eastAsia="en-IN"/>
+        </w:rPr>
+      </w:pPr>
+    </w:p>
+    <w:p>
+      <w:pPr>
+        <w:pStyle w:val="Heading2"/>
+        <w:spacing w:after="240"/>
+        <w:rPr>
+          <w:rFonts w:ascii="Comic Sans MS" w:eastAsia="Times New Roman" w:hAnsi="Comic Sans MS" w:cstheme="majorHAnsi"/>
+          <w:bCs/>
+          <w:sz w:val="24"/>
+          <w:szCs w:val="24"/>
+          <w:lang w:eastAsia="en-IN"/>
+        </w:rPr>
+      </w:pPr>
+      <w:bookmarkStart w:id="5" w:name="_Toc240881064"/>
       <w:r>
         <w:rPr>
           <w:rFonts w:ascii="Comic Sans MS" w:hAnsi="Comic Sans MS" w:cs="Segoe UI Symbol"/>
           <w:sz w:val="28"/>
         </w:rPr>
-        <w:t xml:space="preserve">What </w:t>
+        <w:t>Q4</w:t>
       </w:r>
       <w:r>
         <w:rPr>
           <w:rFonts w:ascii="Comic Sans MS" w:hAnsi="Comic Sans MS" w:cs="Segoe UI Symbol"/>
           <w:sz w:val="28"/>
         </w:rPr>
-        <w:t>is difference between multithreading and multitasking?</w:t>
-      </w:r>
-      <w:bookmarkEnd w:id="5"/>
-    </w:p>
-    <w:p>
-      <w:pPr>
-        <w:spacing w:after="0" w:line="240" w:lineRule="auto"/>
-        <w:rPr>
-          <w:rFonts w:ascii="Comic Sans MS" w:eastAsia="Times New Roman" w:hAnsi="Comic Sans MS" w:cstheme="majorHAnsi"/>
-          <w:bCs/>
-          <w:sz w:val="24"/>
-          <w:szCs w:val="24"/>
-          <w:lang w:eastAsia="en-IN"/>
-        </w:rPr>
-      </w:pPr>
-      <w:r>
-        <w:rPr>
-          <w:rFonts w:ascii="Comic Sans MS" w:eastAsia="Times New Roman" w:hAnsi="Comic Sans MS" w:cstheme="majorHAnsi"/>
-          <w:bCs/>
-          <w:sz w:val="24"/>
-          <w:szCs w:val="24"/>
-          <w:lang w:eastAsia="en-IN"/>
-        </w:rPr>
-        <w:t>Multithreading refers to running multiple threads within a single process, while multitasking refers to running multiple independent processes concurrently. Threads share the same memory space, whereas processes have separate memory spaces.</w:t>
-      </w:r>
-    </w:p>
-    <w:p>
-      <w:pPr>
-        <w:spacing w:after="0" w:line="240" w:lineRule="auto"/>
-        <w:rPr>
-          <w:rFonts w:ascii="Comic Sans MS" w:eastAsia="Times New Roman" w:hAnsi="Comic Sans MS" w:cstheme="majorHAnsi"/>
-          <w:bCs/>
-          <w:sz w:val="24"/>
-          <w:szCs w:val="24"/>
-          <w:lang w:eastAsia="en-IN"/>
-        </w:rPr>
-      </w:pPr>
-    </w:p>
-    <w:p>
-      <w:pPr>
-        <w:spacing w:after="0" w:line="240" w:lineRule="auto"/>
-        <w:rPr>
-          <w:rFonts w:ascii="Comic Sans MS" w:eastAsia="Times New Roman" w:hAnsi="Comic Sans MS" w:cstheme="majorHAnsi"/>
-          <w:bCs/>
-          <w:sz w:val="24"/>
-          <w:szCs w:val="24"/>
-          <w:lang w:eastAsia="en-IN"/>
-        </w:rPr>
-      </w:pPr>
-    </w:p>
-    <w:p>
-      <w:pPr>
-        <w:spacing w:after="0" w:line="240" w:lineRule="auto"/>
-        <w:rPr>
-          <w:rFonts w:ascii="Comic Sans MS" w:eastAsia="Times New Roman" w:hAnsi="Comic Sans MS" w:cstheme="majorHAnsi"/>
-          <w:bCs/>
-          <w:sz w:val="24"/>
-          <w:szCs w:val="24"/>
-          <w:lang w:eastAsia="en-IN"/>
-        </w:rPr>
-      </w:pPr>
-    </w:p>
-    <w:p>
-      <w:pPr>
-        <w:spacing w:after="0" w:line="240" w:lineRule="auto"/>
-        <w:rPr>
-          <w:rFonts w:ascii="Comic Sans MS" w:eastAsia="Times New Roman" w:hAnsi="Comic Sans MS" w:cstheme="majorHAnsi"/>
-          <w:bCs/>
-          <w:sz w:val="24"/>
-          <w:szCs w:val="24"/>
-          <w:lang w:eastAsia="en-IN"/>
-        </w:rPr>
-      </w:pPr>
-    </w:p>
-    <w:p>
-      <w:pPr>
-        <w:spacing w:after="0" w:line="240" w:lineRule="auto"/>
-        <w:rPr>
-          <w:rFonts w:ascii="Comic Sans MS" w:eastAsia="Times New Roman" w:hAnsi="Comic Sans MS" w:cstheme="majorHAnsi"/>
-          <w:bCs/>
-          <w:sz w:val="14"/>
-          <w:szCs w:val="24"/>
-          <w:lang w:eastAsia="en-IN"/>
-        </w:rPr>
-      </w:pPr>
-    </w:p>
-    <w:p>
-      <w:pPr>
-        <w:pStyle w:val="Heading2"/>
-        <w:spacing w:after="240"/>
-        <w:rPr>
-          <w:rFonts w:ascii="Comic Sans MS" w:eastAsia="Times New Roman" w:hAnsi="Comic Sans MS" w:cstheme="majorHAnsi"/>
-          <w:bCs/>
-          <w:sz w:val="24"/>
-          <w:szCs w:val="24"/>
-          <w:lang w:eastAsia="en-IN"/>
-        </w:rPr>
-      </w:pPr>
-      <w:bookmarkStart w:id="6" w:name="_Toc240881064"/>
+        <w:t xml:space="preserve">. </w:t>
+      </w:r>
       <w:r>
         <w:rPr>
           <w:rFonts w:ascii="Comic Sans MS" w:hAnsi="Comic Sans MS" w:cs="Segoe UI Symbol"/>
           <w:sz w:val="28"/>
         </w:rPr>
-        <w:t>Q</w:t>
-      </w:r>
-      <w:r>
-        <w:rPr>
-          <w:rFonts w:ascii="Comic Sans MS" w:hAnsi="Comic Sans MS" w:cs="Segoe UI Symbol"/>
-          <w:sz w:val="28"/>
-        </w:rPr>
-        <w:t>4</w:t>
-      </w:r>
-      <w:r>
-        <w:rPr>
-          <w:rFonts w:ascii="Comic Sans MS" w:hAnsi="Comic Sans MS" w:cs="Segoe UI Symbol"/>
-          <w:sz w:val="28"/>
-        </w:rPr>
-        <w:t xml:space="preserve">. </w:t>
-      </w:r>
-      <w:r>
-        <w:rPr>
-          <w:rFonts w:ascii="Comic Sans MS" w:hAnsi="Comic Sans MS" w:cs="Segoe UI Symbol"/>
-          <w:sz w:val="28"/>
-        </w:rPr>
-        <w:t>What are differe</w:t>
-      </w:r>
-      <w:r>
-        <w:rPr>
-          <w:rFonts w:ascii="Comic Sans MS" w:hAnsi="Comic Sans MS" w:cs="Segoe UI Symbol"/>
-          <w:sz w:val="28"/>
-        </w:rPr>
-        <w:t>nt types of threads?</w:t>
-      </w:r>
-      <w:bookmarkEnd w:id="6"/>
+        <w:t>What are different types of threads?</w:t>
+      </w:r>
+      <w:bookmarkEnd w:id="5"/>
     </w:p>
     <w:p>
       <w:pPr>
@@ -4055,595 +4010,8 @@
           <w:lang w:eastAsia="en-IN"/>
         </w:rPr>
       </w:pPr>
-    </w:p>
-    <w:p>
-      <w:pPr>
-        <w:spacing w:after="0" w:line="240" w:lineRule="auto"/>
-        <w:rPr>
-          <w:rFonts w:ascii="Comic Sans MS" w:eastAsia="Times New Roman" w:hAnsi="Comic Sans MS" w:cstheme="majorHAnsi"/>
-          <w:bCs/>
-          <w:sz w:val="24"/>
-          <w:szCs w:val="24"/>
-          <w:lang w:eastAsia="en-IN"/>
-        </w:rPr>
-      </w:pPr>
-    </w:p>
-    <w:p>
-      <w:pPr>
-        <w:spacing w:after="0" w:line="240" w:lineRule="auto"/>
-        <w:rPr>
-          <w:rFonts w:ascii="Comic Sans MS" w:eastAsia="Times New Roman" w:hAnsi="Comic Sans MS" w:cstheme="majorHAnsi"/>
-          <w:bCs/>
-          <w:sz w:val="24"/>
-          <w:szCs w:val="24"/>
-          <w:lang w:eastAsia="en-IN"/>
-        </w:rPr>
-      </w:pPr>
-    </w:p>
-    <w:p>
-      <w:pPr>
-        <w:spacing w:after="0" w:line="240" w:lineRule="auto"/>
-        <w:rPr>
-          <w:rFonts w:ascii="Comic Sans MS" w:eastAsia="Times New Roman" w:hAnsi="Comic Sans MS" w:cstheme="majorHAnsi"/>
-          <w:bCs/>
-          <w:sz w:val="24"/>
-          <w:szCs w:val="24"/>
-          <w:lang w:eastAsia="en-IN"/>
-        </w:rPr>
-      </w:pPr>
-    </w:p>
-    <w:p>
-      <w:pPr>
-        <w:spacing w:after="0" w:line="240" w:lineRule="auto"/>
-        <w:rPr>
-          <w:rFonts w:ascii="Comic Sans MS" w:eastAsia="Times New Roman" w:hAnsi="Comic Sans MS" w:cstheme="majorHAnsi"/>
-          <w:bCs/>
-          <w:sz w:val="24"/>
-          <w:szCs w:val="24"/>
-          <w:lang w:eastAsia="en-IN"/>
-        </w:rPr>
-      </w:pPr>
-    </w:p>
-    <w:p>
-      <w:pPr>
-        <w:spacing w:after="0" w:line="240" w:lineRule="auto"/>
-        <w:rPr>
-          <w:rFonts w:ascii="Comic Sans MS" w:eastAsia="Times New Roman" w:hAnsi="Comic Sans MS" w:cstheme="majorHAnsi"/>
-          <w:bCs/>
-          <w:sz w:val="24"/>
-          <w:szCs w:val="24"/>
-          <w:lang w:eastAsia="en-IN"/>
-        </w:rPr>
-      </w:pPr>
-    </w:p>
-    <w:p>
-      <w:pPr>
-        <w:spacing w:after="0" w:line="240" w:lineRule="auto"/>
-        <w:rPr>
-          <w:rFonts w:ascii="Comic Sans MS" w:eastAsia="Times New Roman" w:hAnsi="Comic Sans MS" w:cstheme="majorHAnsi"/>
-          <w:bCs/>
-          <w:sz w:val="24"/>
-          <w:szCs w:val="24"/>
-          <w:lang w:eastAsia="en-IN"/>
-        </w:rPr>
-      </w:pPr>
-    </w:p>
-    <w:p>
-      <w:pPr>
-        <w:spacing w:after="0" w:line="240" w:lineRule="auto"/>
-        <w:rPr>
-          <w:rFonts w:ascii="Comic Sans MS" w:eastAsia="Times New Roman" w:hAnsi="Comic Sans MS" w:cstheme="majorHAnsi"/>
-          <w:bCs/>
-          <w:sz w:val="24"/>
-          <w:szCs w:val="24"/>
-          <w:lang w:eastAsia="en-IN"/>
-        </w:rPr>
-      </w:pPr>
-    </w:p>
-    <w:p>
-      <w:pPr>
-        <w:spacing w:after="0" w:line="240" w:lineRule="auto"/>
-        <w:rPr>
-          <w:rFonts w:ascii="Comic Sans MS" w:eastAsia="Times New Roman" w:hAnsi="Comic Sans MS" w:cstheme="majorHAnsi"/>
-          <w:bCs/>
-          <w:sz w:val="24"/>
-          <w:szCs w:val="24"/>
-          <w:lang w:eastAsia="en-IN"/>
-        </w:rPr>
-      </w:pPr>
-    </w:p>
-    <w:p>
-      <w:pPr>
-        <w:spacing w:after="0" w:line="240" w:lineRule="auto"/>
-        <w:rPr>
-          <w:rFonts w:ascii="Comic Sans MS" w:eastAsia="Times New Roman" w:hAnsi="Comic Sans MS" w:cstheme="majorHAnsi"/>
-          <w:bCs/>
-          <w:sz w:val="24"/>
-          <w:szCs w:val="24"/>
-          <w:lang w:eastAsia="en-IN"/>
-        </w:rPr>
-      </w:pPr>
-    </w:p>
-    <w:p>
-      <w:pPr>
-        <w:spacing w:after="0" w:line="240" w:lineRule="auto"/>
-        <w:rPr>
-          <w:rFonts w:ascii="Comic Sans MS" w:eastAsia="Times New Roman" w:hAnsi="Comic Sans MS" w:cstheme="majorHAnsi"/>
-          <w:bCs/>
-          <w:sz w:val="24"/>
-          <w:szCs w:val="24"/>
-          <w:lang w:eastAsia="en-IN"/>
-        </w:rPr>
-      </w:pPr>
-    </w:p>
-    <w:p>
-      <w:pPr>
-        <w:spacing w:after="0" w:line="240" w:lineRule="auto"/>
-        <w:rPr>
-          <w:rFonts w:ascii="Comic Sans MS" w:eastAsia="Times New Roman" w:hAnsi="Comic Sans MS" w:cstheme="majorHAnsi"/>
-          <w:bCs/>
-          <w:sz w:val="24"/>
-          <w:szCs w:val="24"/>
-          <w:lang w:eastAsia="en-IN"/>
-        </w:rPr>
-      </w:pPr>
-    </w:p>
-    <w:p>
-      <w:pPr>
-        <w:spacing w:after="0" w:line="240" w:lineRule="auto"/>
-        <w:rPr>
-          <w:rFonts w:ascii="Comic Sans MS" w:eastAsia="Times New Roman" w:hAnsi="Comic Sans MS" w:cstheme="majorHAnsi"/>
-          <w:bCs/>
-          <w:sz w:val="24"/>
-          <w:szCs w:val="24"/>
-          <w:lang w:eastAsia="en-IN"/>
-        </w:rPr>
-      </w:pPr>
-    </w:p>
-    <w:p>
-      <w:pPr>
-        <w:spacing w:after="0" w:line="240" w:lineRule="auto"/>
-        <w:rPr>
-          <w:rFonts w:ascii="Comic Sans MS" w:eastAsia="Times New Roman" w:hAnsi="Comic Sans MS" w:cstheme="majorHAnsi"/>
-          <w:bCs/>
-          <w:sz w:val="24"/>
-          <w:szCs w:val="24"/>
-          <w:lang w:eastAsia="en-IN"/>
-        </w:rPr>
-      </w:pPr>
-    </w:p>
-    <w:p>
-      <w:pPr>
-        <w:spacing w:after="0" w:line="240" w:lineRule="auto"/>
-        <w:rPr>
-          <w:rFonts w:ascii="Comic Sans MS" w:eastAsia="Times New Roman" w:hAnsi="Comic Sans MS" w:cstheme="majorHAnsi"/>
-          <w:bCs/>
-          <w:sz w:val="24"/>
-          <w:szCs w:val="24"/>
-          <w:lang w:eastAsia="en-IN"/>
-        </w:rPr>
-      </w:pPr>
-    </w:p>
-    <w:p>
-      <w:pPr>
-        <w:spacing w:after="0" w:line="240" w:lineRule="auto"/>
-        <w:rPr>
-          <w:rFonts w:ascii="Comic Sans MS" w:eastAsia="Times New Roman" w:hAnsi="Comic Sans MS" w:cs="Courier New"/>
-          <w:color w:val="CF8E6D"/>
-          <w:sz w:val="20"/>
-          <w:szCs w:val="20"/>
-          <w:lang w:eastAsia="en-IN"/>
-        </w:rPr>
-      </w:pPr>
-    </w:p>
-    <w:p>
-      <w:pPr>
-        <w:spacing w:after="0" w:line="240" w:lineRule="auto"/>
-        <w:rPr>
-          <w:rFonts w:ascii="Comic Sans MS" w:eastAsia="Times New Roman" w:hAnsi="Comic Sans MS" w:cs="Courier New"/>
-          <w:color w:val="CF8E6D"/>
-          <w:sz w:val="20"/>
-          <w:szCs w:val="20"/>
-          <w:lang w:eastAsia="en-IN"/>
-        </w:rPr>
-      </w:pPr>
-    </w:p>
-    <w:p>
-      <w:pPr>
-        <w:spacing w:after="0" w:line="240" w:lineRule="auto"/>
-        <w:rPr>
-          <w:rFonts w:ascii="Comic Sans MS" w:eastAsia="Times New Roman" w:hAnsi="Comic Sans MS" w:cs="Courier New"/>
-          <w:color w:val="CF8E6D"/>
-          <w:sz w:val="20"/>
-          <w:szCs w:val="20"/>
-          <w:lang w:eastAsia="en-IN"/>
-        </w:rPr>
-      </w:pPr>
-    </w:p>
-    <w:p>
-      <w:pPr>
-        <w:spacing w:after="0" w:line="240" w:lineRule="auto"/>
-        <w:rPr>
-          <w:rFonts w:ascii="Comic Sans MS" w:eastAsia="Times New Roman" w:hAnsi="Comic Sans MS" w:cs="Courier New"/>
-          <w:color w:val="CF8E6D"/>
-          <w:sz w:val="20"/>
-          <w:szCs w:val="20"/>
-          <w:lang w:eastAsia="en-IN"/>
-        </w:rPr>
-      </w:pPr>
-    </w:p>
-    <w:p>
-      <w:pPr>
-        <w:spacing w:after="0" w:line="240" w:lineRule="auto"/>
-        <w:rPr>
-          <w:rFonts w:ascii="Comic Sans MS" w:eastAsia="Times New Roman" w:hAnsi="Comic Sans MS" w:cs="Courier New"/>
-          <w:color w:val="CF8E6D"/>
-          <w:sz w:val="20"/>
-          <w:szCs w:val="20"/>
-          <w:lang w:eastAsia="en-IN"/>
-        </w:rPr>
-      </w:pPr>
-    </w:p>
-    <w:p>
-      <w:pPr>
-        <w:spacing w:after="0" w:line="240" w:lineRule="auto"/>
-        <w:rPr>
-          <w:rFonts w:ascii="Comic Sans MS" w:eastAsia="Times New Roman" w:hAnsi="Comic Sans MS" w:cs="Courier New"/>
-          <w:color w:val="CF8E6D"/>
-          <w:sz w:val="20"/>
-          <w:szCs w:val="20"/>
-          <w:lang w:eastAsia="en-IN"/>
-        </w:rPr>
-      </w:pPr>
-    </w:p>
-    <w:p>
-      <w:pPr>
-        <w:spacing w:after="0" w:line="240" w:lineRule="auto"/>
-        <w:rPr>
-          <w:rFonts w:ascii="Comic Sans MS" w:eastAsia="Times New Roman" w:hAnsi="Comic Sans MS" w:cs="Courier New"/>
-          <w:color w:val="CF8E6D"/>
-          <w:sz w:val="20"/>
-          <w:szCs w:val="20"/>
-          <w:lang w:eastAsia="en-IN"/>
-        </w:rPr>
-      </w:pPr>
-    </w:p>
-    <w:p>
-      <w:pPr>
-        <w:spacing w:after="0" w:line="240" w:lineRule="auto"/>
-        <w:rPr>
-          <w:rFonts w:ascii="Comic Sans MS" w:eastAsia="Times New Roman" w:hAnsi="Comic Sans MS" w:cs="Courier New"/>
-          <w:color w:val="CF8E6D"/>
-          <w:sz w:val="20"/>
-          <w:szCs w:val="20"/>
-          <w:lang w:eastAsia="en-IN"/>
-        </w:rPr>
-      </w:pPr>
-    </w:p>
-    <w:p>
-      <w:pPr>
-        <w:spacing w:after="0" w:line="240" w:lineRule="auto"/>
-        <w:rPr>
-          <w:rFonts w:ascii="Comic Sans MS" w:eastAsia="Times New Roman" w:hAnsi="Comic Sans MS" w:cs="Courier New"/>
-          <w:color w:val="CF8E6D"/>
-          <w:sz w:val="20"/>
-          <w:szCs w:val="20"/>
-          <w:lang w:eastAsia="en-IN"/>
-        </w:rPr>
-      </w:pPr>
-    </w:p>
-    <w:p>
-      <w:pPr>
-        <w:spacing w:after="0" w:line="240" w:lineRule="auto"/>
-        <w:rPr>
-          <w:rFonts w:ascii="Comic Sans MS" w:eastAsia="Times New Roman" w:hAnsi="Comic Sans MS" w:cs="Courier New"/>
-          <w:color w:val="CF8E6D"/>
-          <w:sz w:val="20"/>
-          <w:szCs w:val="20"/>
-          <w:lang w:eastAsia="en-IN"/>
-        </w:rPr>
-      </w:pPr>
-    </w:p>
-    <w:p>
-      <w:pPr>
-        <w:spacing w:after="0" w:line="240" w:lineRule="auto"/>
-        <w:rPr>
-          <w:rFonts w:ascii="Comic Sans MS" w:eastAsia="Times New Roman" w:hAnsi="Comic Sans MS" w:cs="Courier New"/>
-          <w:color w:val="CF8E6D"/>
-          <w:sz w:val="20"/>
-          <w:szCs w:val="20"/>
-          <w:lang w:eastAsia="en-IN"/>
-        </w:rPr>
-      </w:pPr>
-    </w:p>
-    <w:p>
-      <w:pPr>
-        <w:spacing w:after="0" w:line="240" w:lineRule="auto"/>
-        <w:rPr>
-          <w:rFonts w:ascii="Comic Sans MS" w:eastAsia="Times New Roman" w:hAnsi="Comic Sans MS" w:cs="Courier New"/>
-          <w:color w:val="CF8E6D"/>
-          <w:sz w:val="20"/>
-          <w:szCs w:val="20"/>
-          <w:lang w:eastAsia="en-IN"/>
-        </w:rPr>
-      </w:pPr>
-    </w:p>
-    <w:p>
-      <w:pPr>
-        <w:spacing w:after="0" w:line="240" w:lineRule="auto"/>
-        <w:rPr>
-          <w:rFonts w:ascii="Comic Sans MS" w:eastAsia="Times New Roman" w:hAnsi="Comic Sans MS" w:cs="Courier New"/>
-          <w:color w:val="CF8E6D"/>
-          <w:sz w:val="20"/>
-          <w:szCs w:val="20"/>
-          <w:lang w:eastAsia="en-IN"/>
-        </w:rPr>
-      </w:pPr>
-    </w:p>
-    <w:p>
-      <w:pPr>
-        <w:tabs>
-          <w:tab w:val="left" w:pos="4051"/>
-        </w:tabs>
-        <w:spacing w:after="0" w:line="240" w:lineRule="auto"/>
-        <w:rPr>
-          <w:rFonts w:ascii="Comic Sans MS" w:eastAsia="Times New Roman" w:hAnsi="Comic Sans MS" w:cs="Courier New"/>
-          <w:color w:val="CF8E6D"/>
-          <w:sz w:val="20"/>
-          <w:szCs w:val="20"/>
-          <w:lang w:eastAsia="en-IN"/>
-        </w:rPr>
-      </w:pPr>
-      <w:r>
-        <w:rPr>
-          <w:rFonts w:ascii="Comic Sans MS" w:eastAsia="Times New Roman" w:hAnsi="Comic Sans MS" w:cs="Courier New"/>
-          <w:color w:val="CF8E6D"/>
-          <w:sz w:val="20"/>
-          <w:szCs w:val="20"/>
-          <w:lang w:eastAsia="en-IN"/>
-        </w:rPr>
-        <w:tab/>
-      </w:r>
-    </w:p>
-    <w:p>
-      <w:pPr>
-        <w:tabs>
-          <w:tab w:val="left" w:pos="4051"/>
-        </w:tabs>
-        <w:spacing w:after="0" w:line="240" w:lineRule="auto"/>
-        <w:rPr>
-          <w:rFonts w:ascii="Comic Sans MS" w:eastAsia="Times New Roman" w:hAnsi="Comic Sans MS" w:cs="Courier New"/>
-          <w:color w:val="CF8E6D"/>
-          <w:sz w:val="20"/>
-          <w:szCs w:val="20"/>
-          <w:lang w:eastAsia="en-IN"/>
-        </w:rPr>
-      </w:pPr>
-    </w:p>
-    <w:p>
-      <w:pPr>
-        <w:tabs>
-          <w:tab w:val="left" w:pos="4051"/>
-        </w:tabs>
-        <w:spacing w:after="0" w:line="240" w:lineRule="auto"/>
-        <w:rPr>
-          <w:rFonts w:ascii="Comic Sans MS" w:eastAsia="Times New Roman" w:hAnsi="Comic Sans MS" w:cs="Courier New"/>
-          <w:color w:val="CF8E6D"/>
-          <w:sz w:val="20"/>
-          <w:szCs w:val="20"/>
-          <w:lang w:eastAsia="en-IN"/>
-        </w:rPr>
-      </w:pPr>
-    </w:p>
-    <w:p>
-      <w:pPr>
-        <w:tabs>
-          <w:tab w:val="left" w:pos="4051"/>
-        </w:tabs>
-        <w:spacing w:after="0" w:line="240" w:lineRule="auto"/>
-        <w:rPr>
-          <w:rFonts w:ascii="Comic Sans MS" w:eastAsia="Times New Roman" w:hAnsi="Comic Sans MS" w:cs="Courier New"/>
-          <w:color w:val="CF8E6D"/>
-          <w:sz w:val="20"/>
-          <w:szCs w:val="20"/>
-          <w:lang w:eastAsia="en-IN"/>
-        </w:rPr>
-      </w:pPr>
-    </w:p>
-    <w:p>
-      <w:pPr>
-        <w:tabs>
-          <w:tab w:val="left" w:pos="4051"/>
-        </w:tabs>
-        <w:spacing w:after="0" w:line="240" w:lineRule="auto"/>
-        <w:rPr>
-          <w:rFonts w:ascii="Comic Sans MS" w:eastAsia="Times New Roman" w:hAnsi="Comic Sans MS" w:cs="Courier New"/>
-          <w:color w:val="CF8E6D"/>
-          <w:sz w:val="20"/>
-          <w:szCs w:val="20"/>
-          <w:lang w:eastAsia="en-IN"/>
-        </w:rPr>
-      </w:pPr>
-    </w:p>
-    <w:p>
-      <w:pPr>
-        <w:tabs>
-          <w:tab w:val="left" w:pos="4051"/>
-        </w:tabs>
-        <w:spacing w:after="0" w:line="240" w:lineRule="auto"/>
-        <w:rPr>
-          <w:rFonts w:ascii="Comic Sans MS" w:eastAsia="Times New Roman" w:hAnsi="Comic Sans MS" w:cs="Courier New"/>
-          <w:color w:val="CF8E6D"/>
-          <w:sz w:val="20"/>
-          <w:szCs w:val="20"/>
-          <w:lang w:eastAsia="en-IN"/>
-        </w:rPr>
-      </w:pPr>
-    </w:p>
-    <w:p>
-      <w:pPr>
-        <w:tabs>
-          <w:tab w:val="left" w:pos="4051"/>
-        </w:tabs>
-        <w:spacing w:after="0" w:line="240" w:lineRule="auto"/>
-        <w:rPr>
-          <w:rFonts w:ascii="Comic Sans MS" w:eastAsia="Times New Roman" w:hAnsi="Comic Sans MS" w:cs="Courier New"/>
-          <w:color w:val="CF8E6D"/>
-          <w:sz w:val="20"/>
-          <w:szCs w:val="20"/>
-          <w:lang w:eastAsia="en-IN"/>
-        </w:rPr>
-      </w:pPr>
-    </w:p>
-    <w:p>
-      <w:pPr>
-        <w:tabs>
-          <w:tab w:val="left" w:pos="4051"/>
-        </w:tabs>
-        <w:spacing w:after="0" w:line="240" w:lineRule="auto"/>
-        <w:rPr>
-          <w:rFonts w:ascii="Comic Sans MS" w:eastAsia="Times New Roman" w:hAnsi="Comic Sans MS" w:cs="Courier New"/>
-          <w:color w:val="CF8E6D"/>
-          <w:sz w:val="20"/>
-          <w:szCs w:val="20"/>
-          <w:lang w:eastAsia="en-IN"/>
-        </w:rPr>
-      </w:pPr>
-    </w:p>
-    <w:p>
-      <w:pPr>
-        <w:tabs>
-          <w:tab w:val="left" w:pos="4051"/>
-        </w:tabs>
-        <w:spacing w:after="0" w:line="240" w:lineRule="auto"/>
-        <w:rPr>
-          <w:rFonts w:ascii="Comic Sans MS" w:eastAsia="Times New Roman" w:hAnsi="Comic Sans MS" w:cs="Courier New"/>
-          <w:color w:val="CF8E6D"/>
-          <w:sz w:val="20"/>
-          <w:szCs w:val="20"/>
-          <w:lang w:eastAsia="en-IN"/>
-        </w:rPr>
-      </w:pPr>
-    </w:p>
-    <w:p>
-      <w:pPr>
-        <w:tabs>
-          <w:tab w:val="left" w:pos="4051"/>
-        </w:tabs>
-        <w:spacing w:after="0" w:line="240" w:lineRule="auto"/>
-        <w:rPr>
-          <w:rFonts w:ascii="Comic Sans MS" w:eastAsia="Times New Roman" w:hAnsi="Comic Sans MS" w:cs="Courier New"/>
-          <w:color w:val="CF8E6D"/>
-          <w:sz w:val="20"/>
-          <w:szCs w:val="20"/>
-          <w:lang w:eastAsia="en-IN"/>
-        </w:rPr>
-      </w:pPr>
-    </w:p>
-    <w:p>
-      <w:pPr>
-        <w:tabs>
-          <w:tab w:val="left" w:pos="4051"/>
-        </w:tabs>
-        <w:spacing w:after="0" w:line="240" w:lineRule="auto"/>
-        <w:rPr>
-          <w:rFonts w:ascii="Comic Sans MS" w:eastAsia="Times New Roman" w:hAnsi="Comic Sans MS" w:cs="Courier New"/>
-          <w:color w:val="CF8E6D"/>
-          <w:sz w:val="20"/>
-          <w:szCs w:val="20"/>
-          <w:lang w:eastAsia="en-IN"/>
-        </w:rPr>
-      </w:pPr>
-    </w:p>
-    <w:p>
-      <w:pPr>
-        <w:tabs>
-          <w:tab w:val="left" w:pos="4051"/>
-        </w:tabs>
-        <w:spacing w:after="0" w:line="240" w:lineRule="auto"/>
-        <w:rPr>
-          <w:rFonts w:ascii="Comic Sans MS" w:eastAsia="Times New Roman" w:hAnsi="Comic Sans MS" w:cs="Courier New"/>
-          <w:color w:val="CF8E6D"/>
-          <w:sz w:val="20"/>
-          <w:szCs w:val="20"/>
-          <w:lang w:eastAsia="en-IN"/>
-        </w:rPr>
-      </w:pPr>
-    </w:p>
-    <w:p>
-      <w:pPr>
-        <w:tabs>
-          <w:tab w:val="left" w:pos="4051"/>
-        </w:tabs>
-        <w:spacing w:after="0" w:line="240" w:lineRule="auto"/>
-        <w:rPr>
-          <w:rFonts w:ascii="Comic Sans MS" w:eastAsia="Times New Roman" w:hAnsi="Comic Sans MS" w:cs="Courier New"/>
-          <w:color w:val="CF8E6D"/>
-          <w:sz w:val="20"/>
-          <w:szCs w:val="20"/>
-          <w:lang w:eastAsia="en-IN"/>
-        </w:rPr>
-      </w:pPr>
-    </w:p>
-    <w:p>
-      <w:pPr>
-        <w:spacing w:after="0" w:line="240" w:lineRule="auto"/>
-        <w:rPr>
-          <w:rFonts w:ascii="Comic Sans MS" w:eastAsia="Times New Roman" w:hAnsi="Comic Sans MS" w:cs="Courier New"/>
-          <w:color w:val="CF8E6D"/>
-          <w:sz w:val="20"/>
-          <w:szCs w:val="20"/>
-          <w:lang w:eastAsia="en-IN"/>
-        </w:rPr>
-      </w:pPr>
-    </w:p>
-    <w:p>
-      <w:pPr>
-        <w:spacing w:after="0" w:line="240" w:lineRule="auto"/>
-        <w:rPr>
-          <w:rFonts w:ascii="Comic Sans MS" w:eastAsia="Times New Roman" w:hAnsi="Comic Sans MS" w:cs="Courier New"/>
-          <w:color w:val="CF8E6D"/>
-          <w:sz w:val="20"/>
-          <w:szCs w:val="20"/>
-          <w:lang w:eastAsia="en-IN"/>
-        </w:rPr>
-      </w:pPr>
-    </w:p>
-    <w:p>
-      <w:pPr>
-        <w:spacing w:after="0" w:line="240" w:lineRule="auto"/>
-        <w:rPr>
-          <w:rFonts w:ascii="Comic Sans MS" w:eastAsia="Times New Roman" w:hAnsi="Comic Sans MS" w:cs="Courier New"/>
-          <w:color w:val="CF8E6D"/>
-          <w:sz w:val="20"/>
-          <w:szCs w:val="20"/>
-          <w:lang w:eastAsia="en-IN"/>
-        </w:rPr>
-      </w:pPr>
-    </w:p>
-    <w:p>
-      <w:pPr>
-        <w:spacing w:after="0" w:line="240" w:lineRule="auto"/>
-        <w:rPr>
-          <w:rFonts w:ascii="Comic Sans MS" w:eastAsia="Times New Roman" w:hAnsi="Comic Sans MS" w:cstheme="majorHAnsi"/>
-          <w:bCs/>
-          <w:sz w:val="24"/>
-          <w:szCs w:val="24"/>
-          <w:lang w:eastAsia="en-IN"/>
-        </w:rPr>
-      </w:pPr>
-    </w:p>
-    <w:p>
-      <w:pPr>
-        <w:spacing w:after="0" w:line="240" w:lineRule="auto"/>
-        <w:rPr>
-          <w:rFonts w:ascii="Comic Sans MS" w:eastAsia="Times New Roman" w:hAnsi="Comic Sans MS" w:cstheme="majorHAnsi"/>
-          <w:bCs/>
-          <w:sz w:val="24"/>
-          <w:szCs w:val="24"/>
-          <w:lang w:eastAsia="en-IN"/>
-        </w:rPr>
-      </w:pPr>
+      <w:bookmarkStart w:id="6" w:name="_GoBack"/>
+      <w:bookmarkEnd w:id="6"/>
     </w:p>
     <w:p>
       <w:pPr>
@@ -4830,7 +4198,6 @@
                 <w:lang w:eastAsia="en-IN"/>
               </w:rPr>
             </w:pPr>
-            <w:proofErr w:type="spellStart"/>
             <w:r>
               <w:rPr>
                 <w:rFonts w:ascii="Comic Sans MS" w:eastAsia="Times New Roman" w:hAnsi="Comic Sans MS" w:cstheme="majorHAnsi"/>
@@ -4840,19 +4207,7 @@
                 <w:szCs w:val="24"/>
                 <w:lang w:eastAsia="en-IN"/>
               </w:rPr>
-              <w:t>Thread.sleep</w:t>
-            </w:r>
-            <w:proofErr w:type="spellEnd"/>
-            <w:r>
-              <w:rPr>
-                <w:rFonts w:ascii="Comic Sans MS" w:eastAsia="Times New Roman" w:hAnsi="Comic Sans MS" w:cstheme="majorHAnsi"/>
-                <w:b/>
-                <w:bCs/>
-                <w:sz w:val="24"/>
-                <w:szCs w:val="24"/>
-                <w:lang w:eastAsia="en-IN"/>
-              </w:rPr>
-              <w:t>()</w:t>
+              <w:t>Thread.sleep()</w:t>
             </w:r>
           </w:p>
         </w:tc>
@@ -4881,7 +4236,6 @@
                 <w:lang w:eastAsia="en-IN"/>
               </w:rPr>
             </w:pPr>
-            <w:proofErr w:type="spellStart"/>
             <w:r>
               <w:rPr>
                 <w:rFonts w:ascii="Comic Sans MS" w:eastAsia="Times New Roman" w:hAnsi="Comic Sans MS" w:cstheme="majorHAnsi"/>
@@ -4891,19 +4245,7 @@
                 <w:szCs w:val="24"/>
                 <w:lang w:eastAsia="en-IN"/>
               </w:rPr>
-              <w:t>Object.wait</w:t>
-            </w:r>
-            <w:proofErr w:type="spellEnd"/>
-            <w:r>
-              <w:rPr>
-                <w:rFonts w:ascii="Comic Sans MS" w:eastAsia="Times New Roman" w:hAnsi="Comic Sans MS" w:cstheme="majorHAnsi"/>
-                <w:b/>
-                <w:bCs/>
-                <w:sz w:val="24"/>
-                <w:szCs w:val="24"/>
-                <w:lang w:eastAsia="en-IN"/>
-              </w:rPr>
-              <w:t>()</w:t>
+              <w:t>Object.wait()</w:t>
             </w:r>
           </w:p>
         </w:tc>
@@ -5532,51 +4874,7 @@
                 <w:szCs w:val="24"/>
                 <w:lang w:eastAsia="en-IN"/>
               </w:rPr>
-              <w:t>Must be explicitly notified using </w:t>
-            </w:r>
-            <w:proofErr w:type="gramStart"/>
-            <w:r>
-              <w:rPr>
-                <w:rFonts w:ascii="Comic Sans MS" w:eastAsia="Times New Roman" w:hAnsi="Comic Sans MS" w:cstheme="majorHAnsi"/>
-                <w:bCs/>
-                <w:sz w:val="24"/>
-                <w:szCs w:val="24"/>
-                <w:lang w:eastAsia="en-IN"/>
-              </w:rPr>
-              <w:t>notify(</w:t>
-            </w:r>
-            <w:proofErr w:type="gramEnd"/>
-            <w:r>
-              <w:rPr>
-                <w:rFonts w:ascii="Comic Sans MS" w:eastAsia="Times New Roman" w:hAnsi="Comic Sans MS" w:cstheme="majorHAnsi"/>
-                <w:bCs/>
-                <w:sz w:val="24"/>
-                <w:szCs w:val="24"/>
-                <w:lang w:eastAsia="en-IN"/>
-              </w:rPr>
-              <w:t>) or </w:t>
-            </w:r>
-            <w:proofErr w:type="spellStart"/>
-            <w:r>
-              <w:rPr>
-                <w:rFonts w:ascii="Comic Sans MS" w:eastAsia="Times New Roman" w:hAnsi="Comic Sans MS" w:cstheme="majorHAnsi"/>
-                <w:bCs/>
-                <w:sz w:val="24"/>
-                <w:szCs w:val="24"/>
-                <w:lang w:eastAsia="en-IN"/>
-              </w:rPr>
-              <w:t>notifyAll</w:t>
-            </w:r>
-            <w:proofErr w:type="spellEnd"/>
-            <w:r>
-              <w:rPr>
-                <w:rFonts w:ascii="Comic Sans MS" w:eastAsia="Times New Roman" w:hAnsi="Comic Sans MS" w:cstheme="majorHAnsi"/>
-                <w:bCs/>
-                <w:sz w:val="24"/>
-                <w:szCs w:val="24"/>
-                <w:lang w:eastAsia="en-IN"/>
-              </w:rPr>
-              <w:t>().</w:t>
+              <w:t>Must be explicitly notified using notify() or notifyAll().</w:t>
             </w:r>
           </w:p>
         </w:tc>
@@ -5655,29 +4953,7 @@
                 <w:szCs w:val="24"/>
                 <w:lang w:eastAsia="en-IN"/>
               </w:rPr>
-              <w:t>Can throw </w:t>
-            </w:r>
-            <w:proofErr w:type="spellStart"/>
-            <w:r>
-              <w:rPr>
-                <w:rFonts w:ascii="Comic Sans MS" w:eastAsia="Times New Roman" w:hAnsi="Comic Sans MS" w:cstheme="majorHAnsi"/>
-                <w:bCs/>
-                <w:sz w:val="24"/>
-                <w:szCs w:val="24"/>
-                <w:lang w:eastAsia="en-IN"/>
-              </w:rPr>
-              <w:t>InterruptedException</w:t>
-            </w:r>
-            <w:proofErr w:type="spellEnd"/>
-            <w:r>
-              <w:rPr>
-                <w:rFonts w:ascii="Comic Sans MS" w:eastAsia="Times New Roman" w:hAnsi="Comic Sans MS" w:cstheme="majorHAnsi"/>
-                <w:bCs/>
-                <w:sz w:val="24"/>
-                <w:szCs w:val="24"/>
-                <w:lang w:eastAsia="en-IN"/>
-              </w:rPr>
-              <w:t>.</w:t>
+              <w:t>Can throw InterruptedException.</w:t>
             </w:r>
           </w:p>
         </w:tc>
@@ -5713,29 +4989,7 @@
                 <w:szCs w:val="24"/>
                 <w:lang w:eastAsia="en-IN"/>
               </w:rPr>
-              <w:t>Can throw </w:t>
-            </w:r>
-            <w:proofErr w:type="spellStart"/>
-            <w:r>
-              <w:rPr>
-                <w:rFonts w:ascii="Comic Sans MS" w:eastAsia="Times New Roman" w:hAnsi="Comic Sans MS" w:cstheme="majorHAnsi"/>
-                <w:bCs/>
-                <w:sz w:val="24"/>
-                <w:szCs w:val="24"/>
-                <w:lang w:eastAsia="en-IN"/>
-              </w:rPr>
-              <w:t>InterruptedException</w:t>
-            </w:r>
-            <w:proofErr w:type="spellEnd"/>
-            <w:r>
-              <w:rPr>
-                <w:rFonts w:ascii="Comic Sans MS" w:eastAsia="Times New Roman" w:hAnsi="Comic Sans MS" w:cstheme="majorHAnsi"/>
-                <w:bCs/>
-                <w:sz w:val="24"/>
-                <w:szCs w:val="24"/>
-                <w:lang w:eastAsia="en-IN"/>
-              </w:rPr>
-              <w:t>.</w:t>
+              <w:t>Can throw InterruptedException.</w:t>
             </w:r>
           </w:p>
         </w:tc>
@@ -5776,21 +5030,12 @@
         </w:rPr>
         <w:t xml:space="preserve">class </w:t>
       </w:r>
-      <w:proofErr w:type="spellStart"/>
       <w:r>
         <w:rPr>
           <w:color w:val="BCBEC4"/>
           <w:sz w:val="22"/>
         </w:rPr>
-        <w:t>WaitNotifyExample</w:t>
-      </w:r>
-      <w:proofErr w:type="spellEnd"/>
-      <w:r>
-        <w:rPr>
-          <w:color w:val="BCBEC4"/>
-          <w:sz w:val="22"/>
-        </w:rPr>
-        <w:t xml:space="preserve"> {</w:t>
+        <w:t>WaitNotifyExample {</w:t>
       </w:r>
       <w:r>
         <w:rPr>
@@ -5819,23 +5064,7 @@
           <w:color w:val="BCBEC4"/>
           <w:sz w:val="22"/>
         </w:rPr>
-        <w:t xml:space="preserve">(String[] </w:t>
-      </w:r>
-      <w:proofErr w:type="spellStart"/>
-      <w:r>
-        <w:rPr>
-          <w:color w:val="BCBEC4"/>
-          <w:sz w:val="22"/>
-        </w:rPr>
-        <w:t>args</w:t>
-      </w:r>
-      <w:proofErr w:type="spellEnd"/>
-      <w:r>
-        <w:rPr>
-          <w:color w:val="BCBEC4"/>
-          <w:sz w:val="22"/>
-        </w:rPr>
-        <w:t>) {</w:t>
+        <w:t>(String[] args) {</w:t>
       </w:r>
       <w:r>
         <w:rPr>
@@ -5966,15 +5195,7 @@
           <w:sz w:val="22"/>
         </w:rPr>
         <w:br/>
-        <w:t xml:space="preserve">                    </w:t>
-      </w:r>
-      <w:proofErr w:type="spellStart"/>
-      <w:r>
-        <w:rPr>
-          <w:color w:val="BCBEC4"/>
-          <w:sz w:val="22"/>
-        </w:rPr>
-        <w:t>System.</w:t>
+        <w:t xml:space="preserve">                    System.</w:t>
       </w:r>
       <w:r>
         <w:rPr>
@@ -5990,15 +5211,7 @@
           <w:color w:val="BCBEC4"/>
           <w:sz w:val="22"/>
         </w:rPr>
-        <w:t>.println</w:t>
-      </w:r>
-      <w:proofErr w:type="spellEnd"/>
-      <w:r>
-        <w:rPr>
-          <w:color w:val="BCBEC4"/>
-          <w:sz w:val="22"/>
-        </w:rPr>
-        <w:t>(</w:t>
+        <w:t>.println(</w:t>
       </w:r>
       <w:r>
         <w:rPr>
@@ -6022,7 +5235,6 @@
         <w:br/>
         <w:t xml:space="preserve">                    </w:t>
       </w:r>
-      <w:proofErr w:type="spellStart"/>
       <w:r>
         <w:rPr>
           <w:color w:val="C77DBB"/>
@@ -6035,15 +5247,7 @@
           <w:color w:val="BCBEC4"/>
           <w:sz w:val="22"/>
         </w:rPr>
-        <w:t>.wait</w:t>
-      </w:r>
-      <w:proofErr w:type="spellEnd"/>
-      <w:r>
-        <w:rPr>
-          <w:color w:val="BCBEC4"/>
-          <w:sz w:val="22"/>
-        </w:rPr>
-        <w:t xml:space="preserve">(); </w:t>
+        <w:t xml:space="preserve">.wait(); </w:t>
       </w:r>
       <w:r>
         <w:rPr>
@@ -6060,7 +5264,6 @@
         <w:br/>
         <w:t xml:space="preserve">                    </w:t>
       </w:r>
-      <w:proofErr w:type="spellStart"/>
       <w:r>
         <w:rPr>
           <w:color w:val="BCBEC4"/>
@@ -6082,15 +5285,7 @@
           <w:color w:val="BCBEC4"/>
           <w:sz w:val="22"/>
         </w:rPr>
-        <w:t>.println</w:t>
-      </w:r>
-      <w:proofErr w:type="spellEnd"/>
-      <w:r>
-        <w:rPr>
-          <w:color w:val="BCBEC4"/>
-          <w:sz w:val="22"/>
-        </w:rPr>
-        <w:t>(</w:t>
+        <w:t>.println(</w:t>
       </w:r>
       <w:r>
         <w:rPr>
@@ -6126,47 +5321,15 @@
           <w:color w:val="BCBEC4"/>
           <w:sz w:val="22"/>
         </w:rPr>
-        <w:t>(</w:t>
-      </w:r>
-      <w:proofErr w:type="spellStart"/>
+        <w:t>(InterruptedException e) {</w:t>
+      </w:r>
       <w:r>
         <w:rPr>
           <w:color w:val="BCBEC4"/>
           <w:sz w:val="22"/>
         </w:rPr>
-        <w:t>InterruptedException</w:t>
-      </w:r>
-      <w:proofErr w:type="spellEnd"/>
-      <w:r>
-        <w:rPr>
-          <w:color w:val="BCBEC4"/>
-          <w:sz w:val="22"/>
-        </w:rPr>
-        <w:t xml:space="preserve"> e) {</w:t>
-      </w:r>
-      <w:r>
-        <w:rPr>
-          <w:color w:val="BCBEC4"/>
-          <w:sz w:val="22"/>
-        </w:rPr>
         <w:br/>
-        <w:t xml:space="preserve">                    </w:t>
-      </w:r>
-      <w:proofErr w:type="spellStart"/>
-      <w:r>
-        <w:rPr>
-          <w:color w:val="BCBEC4"/>
-          <w:sz w:val="22"/>
-        </w:rPr>
-        <w:t>e.printStackTrace</w:t>
-      </w:r>
-      <w:proofErr w:type="spellEnd"/>
-      <w:r>
-        <w:rPr>
-          <w:color w:val="BCBEC4"/>
-          <w:sz w:val="22"/>
-        </w:rPr>
-        <w:t>();</w:t>
+        <w:t xml:space="preserve">                    e.printStackTrace();</w:t>
       </w:r>
       <w:r>
         <w:rPr>
@@ -6263,15 +5426,7 @@
           <w:sz w:val="22"/>
         </w:rPr>
         <w:br/>
-        <w:t xml:space="preserve">                </w:t>
-      </w:r>
-      <w:proofErr w:type="spellStart"/>
-      <w:r>
-        <w:rPr>
-          <w:color w:val="BCBEC4"/>
-          <w:sz w:val="22"/>
-        </w:rPr>
-        <w:t>System.</w:t>
+        <w:t xml:space="preserve">                System.</w:t>
       </w:r>
       <w:r>
         <w:rPr>
@@ -6287,15 +5442,7 @@
           <w:color w:val="BCBEC4"/>
           <w:sz w:val="22"/>
         </w:rPr>
-        <w:t>.println</w:t>
-      </w:r>
-      <w:proofErr w:type="spellEnd"/>
-      <w:r>
-        <w:rPr>
-          <w:color w:val="BCBEC4"/>
-          <w:sz w:val="22"/>
-        </w:rPr>
-        <w:t>(</w:t>
+        <w:t>.println(</w:t>
       </w:r>
       <w:r>
         <w:rPr>
@@ -6317,15 +5464,7 @@
           <w:sz w:val="22"/>
         </w:rPr>
         <w:br/>
-        <w:t xml:space="preserve">                </w:t>
-      </w:r>
-      <w:proofErr w:type="spellStart"/>
-      <w:r>
-        <w:rPr>
-          <w:color w:val="BCBEC4"/>
-          <w:sz w:val="22"/>
-        </w:rPr>
-        <w:t>System.</w:t>
+        <w:t xml:space="preserve">                System.</w:t>
       </w:r>
       <w:r>
         <w:rPr>
@@ -6341,15 +5480,7 @@
           <w:color w:val="BCBEC4"/>
           <w:sz w:val="22"/>
         </w:rPr>
-        <w:t>.println</w:t>
-      </w:r>
-      <w:proofErr w:type="spellEnd"/>
-      <w:r>
-        <w:rPr>
-          <w:color w:val="BCBEC4"/>
-          <w:sz w:val="22"/>
-        </w:rPr>
-        <w:t>(</w:t>
+        <w:t>.println(</w:t>
       </w:r>
       <w:r>
         <w:rPr>
@@ -6387,7 +5518,6 @@
         <w:br/>
         <w:t xml:space="preserve">                </w:t>
       </w:r>
-      <w:proofErr w:type="spellStart"/>
       <w:r>
         <w:rPr>
           <w:color w:val="C77DBB"/>
@@ -6400,15 +5530,7 @@
           <w:color w:val="BCBEC4"/>
           <w:sz w:val="22"/>
         </w:rPr>
-        <w:t>.notify</w:t>
-      </w:r>
-      <w:proofErr w:type="spellEnd"/>
-      <w:r>
-        <w:rPr>
-          <w:color w:val="BCBEC4"/>
-          <w:sz w:val="22"/>
-        </w:rPr>
-        <w:t xml:space="preserve">(); </w:t>
+        <w:t xml:space="preserve">.notify(); </w:t>
       </w:r>
       <w:r>
         <w:rPr>
@@ -6476,15 +5598,7 @@
           <w:color w:val="BCBEC4"/>
           <w:sz w:val="22"/>
         </w:rPr>
-        <w:t xml:space="preserve">{ </w:t>
-      </w:r>
-      <w:proofErr w:type="spellStart"/>
-      <w:r>
-        <w:rPr>
-          <w:color w:val="BCBEC4"/>
-          <w:sz w:val="22"/>
-        </w:rPr>
-        <w:t>Thread.</w:t>
+        <w:t>{ Thread.</w:t>
       </w:r>
       <w:r>
         <w:rPr>
@@ -6495,7 +5609,6 @@
         </w:rPr>
         <w:t>sleep</w:t>
       </w:r>
-      <w:proofErr w:type="spellEnd"/>
       <w:r>
         <w:rPr>
           <w:color w:val="BCBEC4"/>
@@ -6529,39 +5642,7 @@
           <w:color w:val="BCBEC4"/>
           <w:sz w:val="22"/>
         </w:rPr>
-        <w:t>(</w:t>
-      </w:r>
-      <w:proofErr w:type="spellStart"/>
-      <w:r>
-        <w:rPr>
-          <w:color w:val="BCBEC4"/>
-          <w:sz w:val="22"/>
-        </w:rPr>
-        <w:t>InterruptedException</w:t>
-      </w:r>
-      <w:proofErr w:type="spellEnd"/>
-      <w:r>
-        <w:rPr>
-          <w:color w:val="BCBEC4"/>
-          <w:sz w:val="22"/>
-        </w:rPr>
-        <w:t xml:space="preserve"> e) { </w:t>
-      </w:r>
-      <w:proofErr w:type="spellStart"/>
-      <w:r>
-        <w:rPr>
-          <w:color w:val="BCBEC4"/>
-          <w:sz w:val="22"/>
-        </w:rPr>
-        <w:t>e.printStackTrace</w:t>
-      </w:r>
-      <w:proofErr w:type="spellEnd"/>
-      <w:r>
-        <w:rPr>
-          <w:color w:val="BCBEC4"/>
-          <w:sz w:val="22"/>
-        </w:rPr>
-        <w:t>(); }</w:t>
+        <w:t>(InterruptedException e) { e.printStackTrace(); }</w:t>
       </w:r>
       <w:r>
         <w:rPr>
@@ -6689,37 +5770,19 @@
           <w:sz w:val="24"/>
         </w:rPr>
       </w:pPr>
-      <w:proofErr w:type="gramStart"/>
       <w:r>
         <w:rPr>
           <w:color w:val="CF8E6D"/>
           <w:sz w:val="24"/>
         </w:rPr>
-        <w:t>public</w:t>
-      </w:r>
-      <w:proofErr w:type="gramEnd"/>
-      <w:r>
-        <w:rPr>
-          <w:color w:val="CF8E6D"/>
-          <w:sz w:val="24"/>
-        </w:rPr>
-        <w:t xml:space="preserve"> class </w:t>
-      </w:r>
-      <w:proofErr w:type="spellStart"/>
-      <w:r>
-        <w:rPr>
-          <w:color w:val="BCBEC4"/>
-          <w:sz w:val="24"/>
-        </w:rPr>
-        <w:t>SleepExample</w:t>
-      </w:r>
-      <w:proofErr w:type="spellEnd"/>
-      <w:r>
-        <w:rPr>
-          <w:color w:val="BCBEC4"/>
-          <w:sz w:val="24"/>
-        </w:rPr>
-        <w:t xml:space="preserve"> {</w:t>
+        <w:t xml:space="preserve">public class </w:t>
+      </w:r>
+      <w:r>
+        <w:rPr>
+          <w:color w:val="BCBEC4"/>
+          <w:sz w:val="24"/>
+        </w:rPr>
+        <w:t>SleepExample {</w:t>
       </w:r>
       <w:r>
         <w:rPr>
@@ -6748,23 +5811,7 @@
           <w:color w:val="BCBEC4"/>
           <w:sz w:val="24"/>
         </w:rPr>
-        <w:t xml:space="preserve">(String[] </w:t>
-      </w:r>
-      <w:proofErr w:type="spellStart"/>
-      <w:r>
-        <w:rPr>
-          <w:color w:val="BCBEC4"/>
-          <w:sz w:val="24"/>
-        </w:rPr>
-        <w:t>args</w:t>
-      </w:r>
-      <w:proofErr w:type="spellEnd"/>
-      <w:r>
-        <w:rPr>
-          <w:color w:val="BCBEC4"/>
-          <w:sz w:val="24"/>
-        </w:rPr>
-        <w:t>) {</w:t>
+        <w:t>(String[] args) {</w:t>
       </w:r>
       <w:r>
         <w:rPr>
@@ -6772,15 +5819,7 @@
           <w:sz w:val="24"/>
         </w:rPr>
         <w:br/>
-        <w:t xml:space="preserve">        </w:t>
-      </w:r>
-      <w:proofErr w:type="spellStart"/>
-      <w:r>
-        <w:rPr>
-          <w:color w:val="BCBEC4"/>
-          <w:sz w:val="24"/>
-        </w:rPr>
-        <w:t>System.</w:t>
+        <w:t xml:space="preserve">        System.</w:t>
       </w:r>
       <w:r>
         <w:rPr>
@@ -6796,15 +5835,7 @@
           <w:color w:val="BCBEC4"/>
           <w:sz w:val="24"/>
         </w:rPr>
-        <w:t>.println</w:t>
-      </w:r>
-      <w:proofErr w:type="spellEnd"/>
-      <w:r>
-        <w:rPr>
-          <w:color w:val="BCBEC4"/>
-          <w:sz w:val="24"/>
-        </w:rPr>
-        <w:t>(</w:t>
+        <w:t>.println(</w:t>
       </w:r>
       <w:r>
         <w:rPr>
@@ -6848,15 +5879,7 @@
           <w:sz w:val="24"/>
         </w:rPr>
         <w:br/>
-        <w:t xml:space="preserve">            </w:t>
-      </w:r>
-      <w:proofErr w:type="spellStart"/>
-      <w:r>
-        <w:rPr>
-          <w:color w:val="BCBEC4"/>
-          <w:sz w:val="24"/>
-        </w:rPr>
-        <w:t>Thread.</w:t>
+        <w:t xml:space="preserve">            Thread.</w:t>
       </w:r>
       <w:r>
         <w:rPr>
@@ -6867,7 +5890,6 @@
         </w:rPr>
         <w:t>sleep</w:t>
       </w:r>
-      <w:proofErr w:type="spellEnd"/>
       <w:r>
         <w:rPr>
           <w:color w:val="BCBEC4"/>
@@ -6923,23 +5945,7 @@
           <w:color w:val="BCBEC4"/>
           <w:sz w:val="24"/>
         </w:rPr>
-        <w:t>(</w:t>
-      </w:r>
-      <w:proofErr w:type="spellStart"/>
-      <w:r>
-        <w:rPr>
-          <w:color w:val="BCBEC4"/>
-          <w:sz w:val="24"/>
-        </w:rPr>
-        <w:t>InterruptedException</w:t>
-      </w:r>
-      <w:proofErr w:type="spellEnd"/>
-      <w:r>
-        <w:rPr>
-          <w:color w:val="BCBEC4"/>
-          <w:sz w:val="24"/>
-        </w:rPr>
-        <w:t xml:space="preserve"> e) {</w:t>
+        <w:t>(InterruptedException e) {</w:t>
       </w:r>
       <w:r>
         <w:rPr>
@@ -6947,23 +5953,7 @@
           <w:sz w:val="24"/>
         </w:rPr>
         <w:br/>
-        <w:t xml:space="preserve">            </w:t>
-      </w:r>
-      <w:proofErr w:type="spellStart"/>
-      <w:r>
-        <w:rPr>
-          <w:color w:val="BCBEC4"/>
-          <w:sz w:val="24"/>
-        </w:rPr>
-        <w:t>e.printStackTrace</w:t>
-      </w:r>
-      <w:proofErr w:type="spellEnd"/>
-      <w:r>
-        <w:rPr>
-          <w:color w:val="BCBEC4"/>
-          <w:sz w:val="24"/>
-        </w:rPr>
-        <w:t>();</w:t>
+        <w:t xml:space="preserve">            e.printStackTrace();</w:t>
       </w:r>
       <w:r>
         <w:rPr>
@@ -6979,15 +5969,7 @@
           <w:sz w:val="24"/>
         </w:rPr>
         <w:br/>
-        <w:t xml:space="preserve">        </w:t>
-      </w:r>
-      <w:proofErr w:type="spellStart"/>
-      <w:r>
-        <w:rPr>
-          <w:color w:val="BCBEC4"/>
-          <w:sz w:val="24"/>
-        </w:rPr>
-        <w:t>System.</w:t>
+        <w:t xml:space="preserve">        System.</w:t>
       </w:r>
       <w:r>
         <w:rPr>
@@ -7003,15 +5985,7 @@
           <w:color w:val="BCBEC4"/>
           <w:sz w:val="24"/>
         </w:rPr>
-        <w:t>.println</w:t>
-      </w:r>
-      <w:proofErr w:type="spellEnd"/>
-      <w:r>
-        <w:rPr>
-          <w:color w:val="BCBEC4"/>
-          <w:sz w:val="24"/>
-        </w:rPr>
-        <w:t>(</w:t>
+        <w:t>.println(</w:t>
       </w:r>
       <w:r>
         <w:rPr>
@@ -7142,51 +6116,21 @@
           <w:rFonts w:ascii="Comic Sans MS" w:hAnsi="Comic Sans MS" w:cs="Segoe UI Symbol"/>
           <w:sz w:val="28"/>
         </w:rPr>
-        <w:t>Q</w:t>
+        <w:t>Q2</w:t>
       </w:r>
       <w:r>
         <w:rPr>
           <w:rFonts w:ascii="Comic Sans MS" w:hAnsi="Comic Sans MS" w:cs="Segoe UI Symbol"/>
           <w:sz w:val="28"/>
         </w:rPr>
-        <w:t>2</w:t>
+        <w:t xml:space="preserve">. </w:t>
       </w:r>
       <w:r>
         <w:rPr>
           <w:rFonts w:ascii="Comic Sans MS" w:hAnsi="Comic Sans MS" w:cs="Segoe UI Symbol"/>
           <w:sz w:val="28"/>
         </w:rPr>
-        <w:t xml:space="preserve">. </w:t>
-      </w:r>
-      <w:r>
-        <w:rPr>
-          <w:rFonts w:ascii="Comic Sans MS" w:hAnsi="Comic Sans MS" w:cs="Segoe UI Symbol"/>
-          <w:sz w:val="28"/>
-        </w:rPr>
-        <w:t xml:space="preserve">What </w:t>
-      </w:r>
-      <w:r>
-        <w:rPr>
-          <w:rFonts w:ascii="Comic Sans MS" w:hAnsi="Comic Sans MS" w:cs="Segoe UI Symbol"/>
-          <w:sz w:val="28"/>
-        </w:rPr>
-        <w:t xml:space="preserve">will happen if </w:t>
-      </w:r>
-      <w:proofErr w:type="gramStart"/>
-      <w:r>
-        <w:rPr>
-          <w:rFonts w:ascii="Comic Sans MS" w:hAnsi="Comic Sans MS" w:cs="Segoe UI Symbol"/>
-          <w:sz w:val="28"/>
-        </w:rPr>
-        <w:t>start(</w:t>
-      </w:r>
-      <w:proofErr w:type="gramEnd"/>
-      <w:r>
-        <w:rPr>
-          <w:rFonts w:ascii="Comic Sans MS" w:hAnsi="Comic Sans MS" w:cs="Segoe UI Symbol"/>
-          <w:sz w:val="28"/>
-        </w:rPr>
-        <w:t>) is called twice on same thread?</w:t>
+        <w:t>What will happen if start() is called twice on same thread?</w:t>
       </w:r>
       <w:bookmarkEnd w:id="13"/>
     </w:p>
@@ -7211,7 +6155,6 @@
         </w:rPr>
         <w:t xml:space="preserve">It throws a </w:t>
       </w:r>
-      <w:proofErr w:type="spellStart"/>
       <w:r>
         <w:rPr>
           <w:rFonts w:ascii="Comic Sans MS" w:eastAsia="Times New Roman" w:hAnsi="Comic Sans MS" w:cstheme="majorHAnsi"/>
@@ -7223,38 +6166,15 @@
         </w:rPr>
         <w:t>java.lang.IllegalThreadStateException</w:t>
       </w:r>
-      <w:proofErr w:type="spellEnd"/>
-      <w:r>
-        <w:rPr>
-          <w:rFonts w:ascii="Comic Sans MS" w:eastAsia="Times New Roman" w:hAnsi="Comic Sans MS" w:cstheme="majorHAnsi"/>
-          <w:bCs/>
-          <w:sz w:val="24"/>
-          <w:szCs w:val="24"/>
-          <w:lang w:eastAsia="en-IN"/>
-        </w:rPr>
-        <w:t xml:space="preserve">. A thread can be started only once in </w:t>
-      </w:r>
-      <w:proofErr w:type="spellStart"/>
-      <w:r>
-        <w:rPr>
-          <w:rFonts w:ascii="Comic Sans MS" w:eastAsia="Times New Roman" w:hAnsi="Comic Sans MS" w:cstheme="majorHAnsi"/>
-          <w:bCs/>
-          <w:sz w:val="24"/>
-          <w:szCs w:val="24"/>
-          <w:lang w:eastAsia="en-IN"/>
-        </w:rPr>
-        <w:t>it’s</w:t>
-      </w:r>
-      <w:proofErr w:type="spellEnd"/>
-      <w:r>
-        <w:rPr>
-          <w:rFonts w:ascii="Comic Sans MS" w:eastAsia="Times New Roman" w:hAnsi="Comic Sans MS" w:cstheme="majorHAnsi"/>
-          <w:bCs/>
-          <w:sz w:val="24"/>
-          <w:szCs w:val="24"/>
-          <w:lang w:eastAsia="en-IN"/>
-        </w:rPr>
-        <w:t xml:space="preserve"> lifecycle.</w:t>
+      <w:r>
+        <w:rPr>
+          <w:rFonts w:ascii="Comic Sans MS" w:eastAsia="Times New Roman" w:hAnsi="Comic Sans MS" w:cstheme="majorHAnsi"/>
+          <w:bCs/>
+          <w:sz w:val="24"/>
+          <w:szCs w:val="24"/>
+          <w:lang w:eastAsia="en-IN"/>
+        </w:rPr>
+        <w:t>. A thread can be started only once in it’s lifecycle.</w:t>
       </w:r>
     </w:p>
     <w:p>
@@ -7304,21 +6224,12 @@
         </w:rPr>
         <w:t xml:space="preserve">new </w:t>
       </w:r>
-      <w:proofErr w:type="gramStart"/>
-      <w:r>
-        <w:rPr>
-          <w:color w:val="BCBEC4"/>
-          <w:sz w:val="24"/>
-        </w:rPr>
-        <w:t>Thread(</w:t>
-      </w:r>
-      <w:proofErr w:type="gramEnd"/>
-      <w:r>
-        <w:rPr>
-          <w:color w:val="BCBEC4"/>
-          <w:sz w:val="24"/>
-        </w:rPr>
-        <w:t>() -&gt; {});</w:t>
+      <w:r>
+        <w:rPr>
+          <w:color w:val="BCBEC4"/>
+          <w:sz w:val="24"/>
+        </w:rPr>
+        <w:t>Thread(() -&gt; {});</w:t>
       </w:r>
       <w:r>
         <w:rPr>
@@ -7326,13 +6237,6 @@
           <w:sz w:val="24"/>
         </w:rPr>
         <w:br/>
-      </w:r>
-      <w:proofErr w:type="spellStart"/>
-      <w:r>
-        <w:rPr>
-          <w:color w:val="BCBEC4"/>
-          <w:sz w:val="24"/>
-        </w:rPr>
         <w:t>t.</w:t>
       </w:r>
       <w:r>
@@ -7342,7 +6246,6 @@
         </w:rPr>
         <w:t>start</w:t>
       </w:r>
-      <w:proofErr w:type="spellEnd"/>
       <w:r>
         <w:rPr>
           <w:color w:val="BCBEC4"/>
@@ -7356,13 +6259,6 @@
           <w:sz w:val="24"/>
         </w:rPr>
         <w:br/>
-      </w:r>
-      <w:proofErr w:type="spellStart"/>
-      <w:r>
-        <w:rPr>
-          <w:color w:val="BCBEC4"/>
-          <w:sz w:val="24"/>
-        </w:rPr>
         <w:t>t.</w:t>
       </w:r>
       <w:r>
@@ -7372,7 +6268,6 @@
         </w:rPr>
         <w:t>start</w:t>
       </w:r>
-      <w:proofErr w:type="spellEnd"/>
       <w:r>
         <w:rPr>
           <w:color w:val="BCBEC4"/>
@@ -7385,17 +6280,8 @@
           <w:color w:val="7A7E85"/>
           <w:sz w:val="24"/>
         </w:rPr>
-        <w:t xml:space="preserve">// </w:t>
-      </w:r>
-      <w:proofErr w:type="spellStart"/>
-      <w:r>
-        <w:rPr>
-          <w:color w:val="7A7E85"/>
-          <w:sz w:val="24"/>
-        </w:rPr>
-        <w:t>IllegalThreadStateException</w:t>
-      </w:r>
-      <w:proofErr w:type="spellEnd"/>
+        <w:t>// IllegalThreadStateException</w:t>
+      </w:r>
     </w:p>
     <w:p>
       <w:pPr>
@@ -7541,35 +6427,21 @@
           <w:rFonts w:ascii="Comic Sans MS" w:hAnsi="Comic Sans MS" w:cs="Segoe UI Symbol"/>
           <w:sz w:val="28"/>
         </w:rPr>
-        <w:t>Q</w:t>
+        <w:t>Q1</w:t>
       </w:r>
       <w:r>
         <w:rPr>
           <w:rFonts w:ascii="Comic Sans MS" w:hAnsi="Comic Sans MS" w:cs="Segoe UI Symbol"/>
           <w:sz w:val="28"/>
         </w:rPr>
-        <w:t>1</w:t>
+        <w:t xml:space="preserve">. </w:t>
       </w:r>
       <w:r>
         <w:rPr>
           <w:rFonts w:ascii="Comic Sans MS" w:hAnsi="Comic Sans MS" w:cs="Segoe UI Symbol"/>
           <w:sz w:val="28"/>
         </w:rPr>
-        <w:t xml:space="preserve">. </w:t>
-      </w:r>
-      <w:r>
-        <w:rPr>
-          <w:rFonts w:ascii="Comic Sans MS" w:hAnsi="Comic Sans MS" w:cs="Segoe UI Symbol"/>
-          <w:sz w:val="28"/>
-        </w:rPr>
-        <w:t xml:space="preserve">What </w:t>
-      </w:r>
-      <w:r>
-        <w:rPr>
-          <w:rFonts w:ascii="Comic Sans MS" w:hAnsi="Comic Sans MS" w:cs="Segoe UI Symbol"/>
-          <w:sz w:val="28"/>
-        </w:rPr>
-        <w:t>is thread safety?</w:t>
+        <w:t>What is thread safety?</w:t>
       </w:r>
       <w:bookmarkEnd w:id="15"/>
     </w:p>
@@ -7592,29 +6464,7 @@
           <w:szCs w:val="24"/>
           <w:lang w:eastAsia="en-IN"/>
         </w:rPr>
-        <w:t xml:space="preserve">A thread-safe class or method guarantees correct </w:t>
-      </w:r>
-      <w:proofErr w:type="spellStart"/>
-      <w:r>
-        <w:rPr>
-          <w:rFonts w:ascii="Comic Sans MS" w:eastAsia="Times New Roman" w:hAnsi="Comic Sans MS" w:cstheme="majorHAnsi"/>
-          <w:bCs/>
-          <w:sz w:val="24"/>
-          <w:szCs w:val="24"/>
-          <w:lang w:eastAsia="en-IN"/>
-        </w:rPr>
-        <w:t>behavior</w:t>
-      </w:r>
-      <w:proofErr w:type="spellEnd"/>
-      <w:r>
-        <w:rPr>
-          <w:rFonts w:ascii="Comic Sans MS" w:eastAsia="Times New Roman" w:hAnsi="Comic Sans MS" w:cstheme="majorHAnsi"/>
-          <w:bCs/>
-          <w:sz w:val="24"/>
-          <w:szCs w:val="24"/>
-          <w:lang w:eastAsia="en-IN"/>
-        </w:rPr>
-        <w:t xml:space="preserve"> when accessed by multiple threads simultaneously.</w:t>
+        <w:t>A thread-safe class or method guarantees correct behavior when accessed by multiple threads simultaneously.</w:t>
       </w:r>
     </w:p>
     <w:p>
@@ -7667,7 +6517,6 @@
         </w:rPr>
         <w:br/>
       </w:r>
-      <w:proofErr w:type="spellStart"/>
       <w:r>
         <w:rPr>
           <w:rFonts w:ascii="Courier New" w:eastAsia="Times New Roman" w:hAnsi="Courier New" w:cs="Courier New"/>
@@ -7676,18 +6525,7 @@
           <w:szCs w:val="20"/>
           <w:lang w:eastAsia="en-IN"/>
         </w:rPr>
-        <w:t>int</w:t>
-      </w:r>
-      <w:proofErr w:type="spellEnd"/>
-      <w:r>
-        <w:rPr>
-          <w:rFonts w:ascii="Courier New" w:eastAsia="Times New Roman" w:hAnsi="Courier New" w:cs="Courier New"/>
-          <w:color w:val="CF8E6D"/>
-          <w:sz w:val="20"/>
-          <w:szCs w:val="20"/>
-          <w:lang w:eastAsia="en-IN"/>
-        </w:rPr>
-        <w:t xml:space="preserve"> </w:t>
+        <w:t xml:space="preserve">int </w:t>
       </w:r>
       <w:r>
         <w:rPr>
@@ -7719,7 +6557,6 @@
         </w:rPr>
         <w:t>0</w:t>
       </w:r>
-      <w:proofErr w:type="gramStart"/>
       <w:r>
         <w:rPr>
           <w:rFonts w:ascii="Courier New" w:eastAsia="Times New Roman" w:hAnsi="Courier New" w:cs="Courier New"/>
@@ -7730,7 +6567,6 @@
         </w:rPr>
         <w:t>;</w:t>
       </w:r>
-      <w:proofErr w:type="gramEnd"/>
       <w:r>
         <w:rPr>
           <w:rFonts w:ascii="Courier New" w:eastAsia="Times New Roman" w:hAnsi="Courier New" w:cs="Courier New"/>
@@ -7833,29 +6669,7 @@
           <w:szCs w:val="24"/>
           <w:lang w:eastAsia="en-IN"/>
         </w:rPr>
-        <w:t xml:space="preserve">Use synchronization or </w:t>
-      </w:r>
-      <w:proofErr w:type="spellStart"/>
-      <w:r>
-        <w:rPr>
-          <w:rFonts w:ascii="Comic Sans MS" w:eastAsia="Times New Roman" w:hAnsi="Comic Sans MS" w:cstheme="majorHAnsi"/>
-          <w:bCs/>
-          <w:sz w:val="24"/>
-          <w:szCs w:val="24"/>
-          <w:lang w:eastAsia="en-IN"/>
-        </w:rPr>
-        <w:t>AtomicInteger</w:t>
-      </w:r>
-      <w:proofErr w:type="spellEnd"/>
-      <w:r>
-        <w:rPr>
-          <w:rFonts w:ascii="Comic Sans MS" w:eastAsia="Times New Roman" w:hAnsi="Comic Sans MS" w:cstheme="majorHAnsi"/>
-          <w:bCs/>
-          <w:sz w:val="24"/>
-          <w:szCs w:val="24"/>
-          <w:lang w:eastAsia="en-IN"/>
-        </w:rPr>
-        <w:t xml:space="preserve"> for thread safety.</w:t>
+        <w:t>Use synchronization or AtomicInteger for thread safety.</w:t>
       </w:r>
     </w:p>
     <w:p>
@@ -7912,35 +6726,21 @@
           <w:rFonts w:ascii="Comic Sans MS" w:hAnsi="Comic Sans MS" w:cs="Segoe UI Symbol"/>
           <w:sz w:val="28"/>
         </w:rPr>
-        <w:t>Q</w:t>
+        <w:t>Q2</w:t>
       </w:r>
       <w:r>
         <w:rPr>
           <w:rFonts w:ascii="Comic Sans MS" w:hAnsi="Comic Sans MS" w:cs="Segoe UI Symbol"/>
           <w:sz w:val="28"/>
         </w:rPr>
-        <w:t>2</w:t>
+        <w:t xml:space="preserve">. </w:t>
       </w:r>
       <w:r>
         <w:rPr>
           <w:rFonts w:ascii="Comic Sans MS" w:hAnsi="Comic Sans MS" w:cs="Segoe UI Symbol"/>
           <w:sz w:val="28"/>
         </w:rPr>
-        <w:t xml:space="preserve">. </w:t>
-      </w:r>
-      <w:r>
-        <w:rPr>
-          <w:rFonts w:ascii="Comic Sans MS" w:hAnsi="Comic Sans MS" w:cs="Segoe UI Symbol"/>
-          <w:sz w:val="28"/>
-        </w:rPr>
-        <w:t xml:space="preserve">What is </w:t>
-      </w:r>
-      <w:r>
-        <w:rPr>
-          <w:rFonts w:ascii="Comic Sans MS" w:hAnsi="Comic Sans MS" w:cs="Segoe UI Symbol"/>
-          <w:sz w:val="28"/>
-        </w:rPr>
-        <w:t>context switching in thread?</w:t>
+        <w:t>What is context switching in thread?</w:t>
       </w:r>
       <w:bookmarkEnd w:id="16"/>
     </w:p>
@@ -8450,14 +7250,7 @@
           <w:rFonts w:ascii="Comic Sans MS" w:hAnsi="Comic Sans MS" w:cs="Segoe UI Symbol"/>
           <w:sz w:val="28"/>
         </w:rPr>
-        <w:t xml:space="preserve">What is </w:t>
-      </w:r>
-      <w:r>
-        <w:rPr>
-          <w:rFonts w:ascii="Comic Sans MS" w:hAnsi="Comic Sans MS" w:cs="Segoe UI Symbol"/>
-          <w:sz w:val="28"/>
-        </w:rPr>
-        <w:t>output for this?</w:t>
+        <w:t>What is output for this?</w:t>
       </w:r>
       <w:bookmarkEnd w:id="18"/>
     </w:p>
@@ -8501,27 +7294,15 @@
         </w:rPr>
         <w:t xml:space="preserve">package </w:t>
       </w:r>
-      <w:proofErr w:type="spellStart"/>
-      <w:r>
-        <w:rPr>
-          <w:rFonts w:ascii="Courier New" w:eastAsia="Times New Roman" w:hAnsi="Courier New" w:cs="Courier New"/>
-          <w:color w:val="BCBEC4"/>
-          <w:sz w:val="20"/>
-          <w:szCs w:val="20"/>
-          <w:lang w:eastAsia="en-IN"/>
-        </w:rPr>
-        <w:t>com.practice.LearnSpring</w:t>
-      </w:r>
-      <w:proofErr w:type="spellEnd"/>
-      <w:r>
-        <w:rPr>
-          <w:rFonts w:ascii="Courier New" w:eastAsia="Times New Roman" w:hAnsi="Courier New" w:cs="Courier New"/>
-          <w:color w:val="BCBEC4"/>
-          <w:sz w:val="20"/>
-          <w:szCs w:val="20"/>
-          <w:lang w:eastAsia="en-IN"/>
-        </w:rPr>
-        <w:t>;</w:t>
+      <w:r>
+        <w:rPr>
+          <w:rFonts w:ascii="Courier New" w:eastAsia="Times New Roman" w:hAnsi="Courier New" w:cs="Courier New"/>
+          <w:color w:val="BCBEC4"/>
+          <w:sz w:val="20"/>
+          <w:szCs w:val="20"/>
+          <w:lang w:eastAsia="en-IN"/>
+        </w:rPr>
+        <w:t>com.practice.LearnSpring;</w:t>
       </w:r>
       <w:r>
         <w:rPr>
@@ -8553,27 +7334,15 @@
         </w:rPr>
         <w:t xml:space="preserve">class </w:t>
       </w:r>
-      <w:proofErr w:type="spellStart"/>
-      <w:r>
-        <w:rPr>
-          <w:rFonts w:ascii="Courier New" w:eastAsia="Times New Roman" w:hAnsi="Courier New" w:cs="Courier New"/>
-          <w:color w:val="BCBEC4"/>
-          <w:sz w:val="20"/>
-          <w:szCs w:val="20"/>
-          <w:lang w:eastAsia="en-IN"/>
-        </w:rPr>
-        <w:t>MyThread</w:t>
-      </w:r>
-      <w:proofErr w:type="spellEnd"/>
-      <w:r>
-        <w:rPr>
-          <w:rFonts w:ascii="Courier New" w:eastAsia="Times New Roman" w:hAnsi="Courier New" w:cs="Courier New"/>
-          <w:color w:val="BCBEC4"/>
-          <w:sz w:val="20"/>
-          <w:szCs w:val="20"/>
-          <w:lang w:eastAsia="en-IN"/>
-        </w:rPr>
-        <w:t xml:space="preserve"> </w:t>
+      <w:r>
+        <w:rPr>
+          <w:rFonts w:ascii="Courier New" w:eastAsia="Times New Roman" w:hAnsi="Courier New" w:cs="Courier New"/>
+          <w:color w:val="BCBEC4"/>
+          <w:sz w:val="20"/>
+          <w:szCs w:val="20"/>
+          <w:lang w:eastAsia="en-IN"/>
+        </w:rPr>
+        <w:t xml:space="preserve">MyThread </w:t>
       </w:r>
       <w:r>
         <w:rPr>
@@ -8614,29 +7383,7 @@
           <w:szCs w:val="20"/>
           <w:lang w:eastAsia="en-IN"/>
         </w:rPr>
-        <w:t>//</w:t>
-      </w:r>
-      <w:proofErr w:type="spellStart"/>
-      <w:r>
-        <w:rPr>
-          <w:rFonts w:ascii="Courier New" w:eastAsia="Times New Roman" w:hAnsi="Courier New" w:cs="Courier New"/>
-          <w:color w:val="7A7E85"/>
-          <w:sz w:val="20"/>
-          <w:szCs w:val="20"/>
-          <w:lang w:eastAsia="en-IN"/>
-        </w:rPr>
-        <w:t>thread.start</w:t>
-      </w:r>
-      <w:proofErr w:type="spellEnd"/>
-      <w:r>
-        <w:rPr>
-          <w:rFonts w:ascii="Courier New" w:eastAsia="Times New Roman" w:hAnsi="Courier New" w:cs="Courier New"/>
-          <w:color w:val="7A7E85"/>
-          <w:sz w:val="20"/>
-          <w:szCs w:val="20"/>
-          <w:lang w:eastAsia="en-IN"/>
-        </w:rPr>
-        <w:t xml:space="preserve"> runs run function ( we must override this in our thread class)</w:t>
+        <w:t>//thread.start runs run function ( we must override this in our thread class)</w:t>
       </w:r>
       <w:r>
         <w:rPr>
@@ -8688,18 +7435,7 @@
           <w:lang w:eastAsia="en-IN"/>
         </w:rPr>
         <w:br/>
-        <w:t xml:space="preserve">        </w:t>
-      </w:r>
-      <w:proofErr w:type="spellStart"/>
-      <w:r>
-        <w:rPr>
-          <w:rFonts w:ascii="Courier New" w:eastAsia="Times New Roman" w:hAnsi="Courier New" w:cs="Courier New"/>
-          <w:color w:val="BCBEC4"/>
-          <w:sz w:val="20"/>
-          <w:szCs w:val="20"/>
-          <w:lang w:eastAsia="en-IN"/>
-        </w:rPr>
-        <w:t>System.</w:t>
+        <w:t xml:space="preserve">        System.</w:t>
       </w:r>
       <w:r>
         <w:rPr>
@@ -8721,18 +7457,7 @@
           <w:szCs w:val="20"/>
           <w:lang w:eastAsia="en-IN"/>
         </w:rPr>
-        <w:t>.println</w:t>
-      </w:r>
-      <w:proofErr w:type="spellEnd"/>
-      <w:r>
-        <w:rPr>
-          <w:rFonts w:ascii="Courier New" w:eastAsia="Times New Roman" w:hAnsi="Courier New" w:cs="Courier New"/>
-          <w:color w:val="BCBEC4"/>
-          <w:sz w:val="20"/>
-          <w:szCs w:val="20"/>
-          <w:lang w:eastAsia="en-IN"/>
-        </w:rPr>
-        <w:t>(</w:t>
+        <w:t>.println(</w:t>
       </w:r>
       <w:r>
         <w:rPr>
@@ -8752,18 +7477,7 @@
           <w:szCs w:val="20"/>
           <w:lang w:eastAsia="en-IN"/>
         </w:rPr>
-        <w:t xml:space="preserve">+ </w:t>
-      </w:r>
-      <w:proofErr w:type="spellStart"/>
-      <w:r>
-        <w:rPr>
-          <w:rFonts w:ascii="Courier New" w:eastAsia="Times New Roman" w:hAnsi="Courier New" w:cs="Courier New"/>
-          <w:color w:val="BCBEC4"/>
-          <w:sz w:val="20"/>
-          <w:szCs w:val="20"/>
-          <w:lang w:eastAsia="en-IN"/>
-        </w:rPr>
-        <w:t>Thread.</w:t>
+        <w:t>+ Thread.</w:t>
       </w:r>
       <w:r>
         <w:rPr>
@@ -8777,38 +7491,15 @@
         </w:rPr>
         <w:t>currentThread</w:t>
       </w:r>
-      <w:proofErr w:type="spellEnd"/>
-      <w:r>
-        <w:rPr>
-          <w:rFonts w:ascii="Courier New" w:eastAsia="Times New Roman" w:hAnsi="Courier New" w:cs="Courier New"/>
-          <w:color w:val="BCBEC4"/>
-          <w:sz w:val="20"/>
-          <w:szCs w:val="20"/>
-          <w:lang w:eastAsia="en-IN"/>
-        </w:rPr>
-        <w:t>().</w:t>
-      </w:r>
-      <w:proofErr w:type="spellStart"/>
-      <w:r>
-        <w:rPr>
-          <w:rFonts w:ascii="Courier New" w:eastAsia="Times New Roman" w:hAnsi="Courier New" w:cs="Courier New"/>
-          <w:color w:val="BCBEC4"/>
-          <w:sz w:val="20"/>
-          <w:szCs w:val="20"/>
-          <w:lang w:eastAsia="en-IN"/>
-        </w:rPr>
-        <w:t>getName</w:t>
-      </w:r>
-      <w:proofErr w:type="spellEnd"/>
-      <w:r>
-        <w:rPr>
-          <w:rFonts w:ascii="Courier New" w:eastAsia="Times New Roman" w:hAnsi="Courier New" w:cs="Courier New"/>
-          <w:color w:val="BCBEC4"/>
-          <w:sz w:val="20"/>
-          <w:szCs w:val="20"/>
-          <w:lang w:eastAsia="en-IN"/>
-        </w:rPr>
-        <w:t>());</w:t>
+      <w:r>
+        <w:rPr>
+          <w:rFonts w:ascii="Courier New" w:eastAsia="Times New Roman" w:hAnsi="Courier New" w:cs="Courier New"/>
+          <w:color w:val="BCBEC4"/>
+          <w:sz w:val="20"/>
+          <w:szCs w:val="20"/>
+          <w:lang w:eastAsia="en-IN"/>
+        </w:rPr>
+        <w:t>().getName());</w:t>
       </w:r>
       <w:r>
         <w:rPr>
@@ -8841,7 +7532,6 @@
         </w:rPr>
         <w:t>(</w:t>
       </w:r>
-      <w:proofErr w:type="spellStart"/>
       <w:r>
         <w:rPr>
           <w:rFonts w:ascii="Courier New" w:eastAsia="Times New Roman" w:hAnsi="Courier New" w:cs="Courier New"/>
@@ -8850,40 +7540,17 @@
           <w:szCs w:val="20"/>
           <w:lang w:eastAsia="en-IN"/>
         </w:rPr>
-        <w:t>int</w:t>
-      </w:r>
-      <w:proofErr w:type="spellEnd"/>
-      <w:r>
-        <w:rPr>
-          <w:rFonts w:ascii="Courier New" w:eastAsia="Times New Roman" w:hAnsi="Courier New" w:cs="Courier New"/>
-          <w:color w:val="CF8E6D"/>
-          <w:sz w:val="20"/>
-          <w:szCs w:val="20"/>
-          <w:lang w:eastAsia="en-IN"/>
-        </w:rPr>
-        <w:t xml:space="preserve"> </w:t>
-      </w:r>
-      <w:proofErr w:type="spellStart"/>
-      <w:r>
-        <w:rPr>
-          <w:rFonts w:ascii="Courier New" w:eastAsia="Times New Roman" w:hAnsi="Courier New" w:cs="Courier New"/>
-          <w:color w:val="BCBEC4"/>
-          <w:sz w:val="20"/>
-          <w:szCs w:val="20"/>
-          <w:lang w:eastAsia="en-IN"/>
-        </w:rPr>
-        <w:t>i</w:t>
-      </w:r>
-      <w:proofErr w:type="spellEnd"/>
-      <w:r>
-        <w:rPr>
-          <w:rFonts w:ascii="Courier New" w:eastAsia="Times New Roman" w:hAnsi="Courier New" w:cs="Courier New"/>
-          <w:color w:val="BCBEC4"/>
-          <w:sz w:val="20"/>
-          <w:szCs w:val="20"/>
-          <w:lang w:eastAsia="en-IN"/>
-        </w:rPr>
-        <w:t>=</w:t>
+        <w:t xml:space="preserve">int </w:t>
+      </w:r>
+      <w:r>
+        <w:rPr>
+          <w:rFonts w:ascii="Courier New" w:eastAsia="Times New Roman" w:hAnsi="Courier New" w:cs="Courier New"/>
+          <w:color w:val="BCBEC4"/>
+          <w:sz w:val="20"/>
+          <w:szCs w:val="20"/>
+          <w:lang w:eastAsia="en-IN"/>
+        </w:rPr>
+        <w:t>i=</w:t>
       </w:r>
       <w:r>
         <w:rPr>
@@ -8934,18 +7601,7 @@
           <w:lang w:eastAsia="en-IN"/>
         </w:rPr>
         <w:br/>
-        <w:t xml:space="preserve">            </w:t>
-      </w:r>
-      <w:proofErr w:type="spellStart"/>
-      <w:r>
-        <w:rPr>
-          <w:rFonts w:ascii="Courier New" w:eastAsia="Times New Roman" w:hAnsi="Courier New" w:cs="Courier New"/>
-          <w:color w:val="BCBEC4"/>
-          <w:sz w:val="20"/>
-          <w:szCs w:val="20"/>
-          <w:lang w:eastAsia="en-IN"/>
-        </w:rPr>
-        <w:t>System.</w:t>
+        <w:t xml:space="preserve">            System.</w:t>
       </w:r>
       <w:r>
         <w:rPr>
@@ -8967,40 +7623,7 @@
           <w:szCs w:val="20"/>
           <w:lang w:eastAsia="en-IN"/>
         </w:rPr>
-        <w:t>.println</w:t>
-      </w:r>
-      <w:proofErr w:type="spellEnd"/>
-      <w:r>
-        <w:rPr>
-          <w:rFonts w:ascii="Courier New" w:eastAsia="Times New Roman" w:hAnsi="Courier New" w:cs="Courier New"/>
-          <w:color w:val="BCBEC4"/>
-          <w:sz w:val="20"/>
-          <w:szCs w:val="20"/>
-          <w:lang w:eastAsia="en-IN"/>
-        </w:rPr>
-        <w:t>(</w:t>
-      </w:r>
-      <w:proofErr w:type="spellStart"/>
-      <w:r>
-        <w:rPr>
-          <w:rFonts w:ascii="Courier New" w:eastAsia="Times New Roman" w:hAnsi="Courier New" w:cs="Courier New"/>
-          <w:color w:val="BCBEC4"/>
-          <w:sz w:val="20"/>
-          <w:szCs w:val="20"/>
-          <w:lang w:eastAsia="en-IN"/>
-        </w:rPr>
-        <w:t>i</w:t>
-      </w:r>
-      <w:proofErr w:type="spellEnd"/>
-      <w:r>
-        <w:rPr>
-          <w:rFonts w:ascii="Courier New" w:eastAsia="Times New Roman" w:hAnsi="Courier New" w:cs="Courier New"/>
-          <w:color w:val="BCBEC4"/>
-          <w:sz w:val="20"/>
-          <w:szCs w:val="20"/>
-          <w:lang w:eastAsia="en-IN"/>
-        </w:rPr>
-        <w:t xml:space="preserve"> + </w:t>
+        <w:t xml:space="preserve">.println(i + </w:t>
       </w:r>
       <w:r>
         <w:rPr>
@@ -9020,18 +7643,7 @@
           <w:szCs w:val="20"/>
           <w:lang w:eastAsia="en-IN"/>
         </w:rPr>
-        <w:t xml:space="preserve">+ </w:t>
-      </w:r>
-      <w:proofErr w:type="spellStart"/>
-      <w:r>
-        <w:rPr>
-          <w:rFonts w:ascii="Courier New" w:eastAsia="Times New Roman" w:hAnsi="Courier New" w:cs="Courier New"/>
-          <w:color w:val="BCBEC4"/>
-          <w:sz w:val="20"/>
-          <w:szCs w:val="20"/>
-          <w:lang w:eastAsia="en-IN"/>
-        </w:rPr>
-        <w:t>Thread.</w:t>
+        <w:t>+ Thread.</w:t>
       </w:r>
       <w:r>
         <w:rPr>
@@ -9045,38 +7657,15 @@
         </w:rPr>
         <w:t>currentThread</w:t>
       </w:r>
-      <w:proofErr w:type="spellEnd"/>
-      <w:r>
-        <w:rPr>
-          <w:rFonts w:ascii="Courier New" w:eastAsia="Times New Roman" w:hAnsi="Courier New" w:cs="Courier New"/>
-          <w:color w:val="BCBEC4"/>
-          <w:sz w:val="20"/>
-          <w:szCs w:val="20"/>
-          <w:lang w:eastAsia="en-IN"/>
-        </w:rPr>
-        <w:t>().</w:t>
-      </w:r>
-      <w:proofErr w:type="spellStart"/>
-      <w:r>
-        <w:rPr>
-          <w:rFonts w:ascii="Courier New" w:eastAsia="Times New Roman" w:hAnsi="Courier New" w:cs="Courier New"/>
-          <w:color w:val="BCBEC4"/>
-          <w:sz w:val="20"/>
-          <w:szCs w:val="20"/>
-          <w:lang w:eastAsia="en-IN"/>
-        </w:rPr>
-        <w:t>getName</w:t>
-      </w:r>
-      <w:proofErr w:type="spellEnd"/>
-      <w:r>
-        <w:rPr>
-          <w:rFonts w:ascii="Courier New" w:eastAsia="Times New Roman" w:hAnsi="Courier New" w:cs="Courier New"/>
-          <w:color w:val="BCBEC4"/>
-          <w:sz w:val="20"/>
-          <w:szCs w:val="20"/>
-          <w:lang w:eastAsia="en-IN"/>
-        </w:rPr>
-        <w:t>());</w:t>
+      <w:r>
+        <w:rPr>
+          <w:rFonts w:ascii="Courier New" w:eastAsia="Times New Roman" w:hAnsi="Courier New" w:cs="Courier New"/>
+          <w:color w:val="BCBEC4"/>
+          <w:sz w:val="20"/>
+          <w:szCs w:val="20"/>
+          <w:lang w:eastAsia="en-IN"/>
+        </w:rPr>
+        <w:t>().getName());</w:t>
       </w:r>
       <w:r>
         <w:rPr>
@@ -9141,27 +7730,15 @@
         </w:rPr>
         <w:t xml:space="preserve">class </w:t>
       </w:r>
-      <w:proofErr w:type="spellStart"/>
-      <w:r>
-        <w:rPr>
-          <w:rFonts w:ascii="Courier New" w:eastAsia="Times New Roman" w:hAnsi="Courier New" w:cs="Courier New"/>
-          <w:color w:val="BCBEC4"/>
-          <w:sz w:val="20"/>
-          <w:szCs w:val="20"/>
-          <w:lang w:eastAsia="en-IN"/>
-        </w:rPr>
-        <w:t>LearnThread</w:t>
-      </w:r>
-      <w:proofErr w:type="spellEnd"/>
-      <w:r>
-        <w:rPr>
-          <w:rFonts w:ascii="Courier New" w:eastAsia="Times New Roman" w:hAnsi="Courier New" w:cs="Courier New"/>
-          <w:color w:val="BCBEC4"/>
-          <w:sz w:val="20"/>
-          <w:szCs w:val="20"/>
-          <w:lang w:eastAsia="en-IN"/>
-        </w:rPr>
-        <w:t>{</w:t>
+      <w:r>
+        <w:rPr>
+          <w:rFonts w:ascii="Courier New" w:eastAsia="Times New Roman" w:hAnsi="Courier New" w:cs="Courier New"/>
+          <w:color w:val="BCBEC4"/>
+          <w:sz w:val="20"/>
+          <w:szCs w:val="20"/>
+          <w:lang w:eastAsia="en-IN"/>
+        </w:rPr>
+        <w:t>LearnThread{</w:t>
       </w:r>
       <w:r>
         <w:rPr>
@@ -9202,29 +7779,7 @@
           <w:szCs w:val="20"/>
           <w:lang w:eastAsia="en-IN"/>
         </w:rPr>
-        <w:t xml:space="preserve">(String[] </w:t>
-      </w:r>
-      <w:proofErr w:type="spellStart"/>
-      <w:r>
-        <w:rPr>
-          <w:rFonts w:ascii="Courier New" w:eastAsia="Times New Roman" w:hAnsi="Courier New" w:cs="Courier New"/>
-          <w:color w:val="BCBEC4"/>
-          <w:sz w:val="20"/>
-          <w:szCs w:val="20"/>
-          <w:lang w:eastAsia="en-IN"/>
-        </w:rPr>
-        <w:t>args</w:t>
-      </w:r>
-      <w:proofErr w:type="spellEnd"/>
-      <w:r>
-        <w:rPr>
-          <w:rFonts w:ascii="Courier New" w:eastAsia="Times New Roman" w:hAnsi="Courier New" w:cs="Courier New"/>
-          <w:color w:val="BCBEC4"/>
-          <w:sz w:val="20"/>
-          <w:szCs w:val="20"/>
-          <w:lang w:eastAsia="en-IN"/>
-        </w:rPr>
-        <w:t xml:space="preserve">) </w:t>
+        <w:t xml:space="preserve">(String[] args) </w:t>
       </w:r>
       <w:r>
         <w:rPr>
@@ -9236,27 +7791,15 @@
         </w:rPr>
         <w:t xml:space="preserve">throws </w:t>
       </w:r>
-      <w:proofErr w:type="spellStart"/>
-      <w:r>
-        <w:rPr>
-          <w:rFonts w:ascii="Courier New" w:eastAsia="Times New Roman" w:hAnsi="Courier New" w:cs="Courier New"/>
-          <w:color w:val="BCBEC4"/>
-          <w:sz w:val="20"/>
-          <w:szCs w:val="20"/>
-          <w:lang w:eastAsia="en-IN"/>
-        </w:rPr>
-        <w:t>InterruptedException</w:t>
-      </w:r>
-      <w:proofErr w:type="spellEnd"/>
-      <w:r>
-        <w:rPr>
-          <w:rFonts w:ascii="Courier New" w:eastAsia="Times New Roman" w:hAnsi="Courier New" w:cs="Courier New"/>
-          <w:color w:val="BCBEC4"/>
-          <w:sz w:val="20"/>
-          <w:szCs w:val="20"/>
-          <w:lang w:eastAsia="en-IN"/>
-        </w:rPr>
-        <w:t xml:space="preserve"> {</w:t>
+      <w:r>
+        <w:rPr>
+          <w:rFonts w:ascii="Courier New" w:eastAsia="Times New Roman" w:hAnsi="Courier New" w:cs="Courier New"/>
+          <w:color w:val="BCBEC4"/>
+          <w:sz w:val="20"/>
+          <w:szCs w:val="20"/>
+          <w:lang w:eastAsia="en-IN"/>
+        </w:rPr>
+        <w:t>InterruptedException {</w:t>
       </w:r>
       <w:r>
         <w:rPr>
@@ -9267,29 +7810,7 @@
           <w:lang w:eastAsia="en-IN"/>
         </w:rPr>
         <w:br/>
-        <w:t xml:space="preserve">        </w:t>
-      </w:r>
-      <w:proofErr w:type="spellStart"/>
-      <w:r>
-        <w:rPr>
-          <w:rFonts w:ascii="Courier New" w:eastAsia="Times New Roman" w:hAnsi="Courier New" w:cs="Courier New"/>
-          <w:color w:val="BCBEC4"/>
-          <w:sz w:val="20"/>
-          <w:szCs w:val="20"/>
-          <w:lang w:eastAsia="en-IN"/>
-        </w:rPr>
-        <w:t>MyThread</w:t>
-      </w:r>
-      <w:proofErr w:type="spellEnd"/>
-      <w:r>
-        <w:rPr>
-          <w:rFonts w:ascii="Courier New" w:eastAsia="Times New Roman" w:hAnsi="Courier New" w:cs="Courier New"/>
-          <w:color w:val="BCBEC4"/>
-          <w:sz w:val="20"/>
-          <w:szCs w:val="20"/>
-          <w:lang w:eastAsia="en-IN"/>
-        </w:rPr>
-        <w:t xml:space="preserve"> m1 = </w:t>
+        <w:t xml:space="preserve">        MyThread m1 = </w:t>
       </w:r>
       <w:r>
         <w:rPr>
@@ -9301,27 +7822,15 @@
         </w:rPr>
         <w:t xml:space="preserve">new </w:t>
       </w:r>
-      <w:proofErr w:type="spellStart"/>
-      <w:r>
-        <w:rPr>
-          <w:rFonts w:ascii="Courier New" w:eastAsia="Times New Roman" w:hAnsi="Courier New" w:cs="Courier New"/>
-          <w:color w:val="BCBEC4"/>
-          <w:sz w:val="20"/>
-          <w:szCs w:val="20"/>
-          <w:lang w:eastAsia="en-IN"/>
-        </w:rPr>
-        <w:t>MyThread</w:t>
-      </w:r>
-      <w:proofErr w:type="spellEnd"/>
-      <w:r>
-        <w:rPr>
-          <w:rFonts w:ascii="Courier New" w:eastAsia="Times New Roman" w:hAnsi="Courier New" w:cs="Courier New"/>
-          <w:color w:val="BCBEC4"/>
-          <w:sz w:val="20"/>
-          <w:szCs w:val="20"/>
-          <w:lang w:eastAsia="en-IN"/>
-        </w:rPr>
-        <w:t>();</w:t>
+      <w:r>
+        <w:rPr>
+          <w:rFonts w:ascii="Courier New" w:eastAsia="Times New Roman" w:hAnsi="Courier New" w:cs="Courier New"/>
+          <w:color w:val="BCBEC4"/>
+          <w:sz w:val="20"/>
+          <w:szCs w:val="20"/>
+          <w:lang w:eastAsia="en-IN"/>
+        </w:rPr>
+        <w:t>MyThread();</w:t>
       </w:r>
       <w:r>
         <w:rPr>
@@ -9332,29 +7841,7 @@
           <w:lang w:eastAsia="en-IN"/>
         </w:rPr>
         <w:br/>
-        <w:t xml:space="preserve">        </w:t>
-      </w:r>
-      <w:proofErr w:type="spellStart"/>
-      <w:r>
-        <w:rPr>
-          <w:rFonts w:ascii="Courier New" w:eastAsia="Times New Roman" w:hAnsi="Courier New" w:cs="Courier New"/>
-          <w:color w:val="BCBEC4"/>
-          <w:sz w:val="20"/>
-          <w:szCs w:val="20"/>
-          <w:lang w:eastAsia="en-IN"/>
-        </w:rPr>
-        <w:t>MyThread</w:t>
-      </w:r>
-      <w:proofErr w:type="spellEnd"/>
-      <w:r>
-        <w:rPr>
-          <w:rFonts w:ascii="Courier New" w:eastAsia="Times New Roman" w:hAnsi="Courier New" w:cs="Courier New"/>
-          <w:color w:val="BCBEC4"/>
-          <w:sz w:val="20"/>
-          <w:szCs w:val="20"/>
-          <w:lang w:eastAsia="en-IN"/>
-        </w:rPr>
-        <w:t xml:space="preserve"> m2 = </w:t>
+        <w:t xml:space="preserve">        MyThread m2 = </w:t>
       </w:r>
       <w:r>
         <w:rPr>
@@ -9366,27 +7853,15 @@
         </w:rPr>
         <w:t xml:space="preserve">new </w:t>
       </w:r>
-      <w:proofErr w:type="spellStart"/>
-      <w:r>
-        <w:rPr>
-          <w:rFonts w:ascii="Courier New" w:eastAsia="Times New Roman" w:hAnsi="Courier New" w:cs="Courier New"/>
-          <w:color w:val="BCBEC4"/>
-          <w:sz w:val="20"/>
-          <w:szCs w:val="20"/>
-          <w:lang w:eastAsia="en-IN"/>
-        </w:rPr>
-        <w:t>MyThread</w:t>
-      </w:r>
-      <w:proofErr w:type="spellEnd"/>
-      <w:r>
-        <w:rPr>
-          <w:rFonts w:ascii="Courier New" w:eastAsia="Times New Roman" w:hAnsi="Courier New" w:cs="Courier New"/>
-          <w:color w:val="BCBEC4"/>
-          <w:sz w:val="20"/>
-          <w:szCs w:val="20"/>
-          <w:lang w:eastAsia="en-IN"/>
-        </w:rPr>
-        <w:t>();</w:t>
+      <w:r>
+        <w:rPr>
+          <w:rFonts w:ascii="Courier New" w:eastAsia="Times New Roman" w:hAnsi="Courier New" w:cs="Courier New"/>
+          <w:color w:val="BCBEC4"/>
+          <w:sz w:val="20"/>
+          <w:szCs w:val="20"/>
+          <w:lang w:eastAsia="en-IN"/>
+        </w:rPr>
+        <w:t>MyThread();</w:t>
       </w:r>
       <w:r>
         <w:rPr>
@@ -9461,18 +7936,7 @@
           <w:lang w:eastAsia="en-IN"/>
         </w:rPr>
         <w:br/>
-        <w:t xml:space="preserve">        </w:t>
-      </w:r>
-      <w:proofErr w:type="spellStart"/>
-      <w:r>
-        <w:rPr>
-          <w:rFonts w:ascii="Courier New" w:eastAsia="Times New Roman" w:hAnsi="Courier New" w:cs="Courier New"/>
-          <w:color w:val="BCBEC4"/>
-          <w:sz w:val="20"/>
-          <w:szCs w:val="20"/>
-          <w:lang w:eastAsia="en-IN"/>
-        </w:rPr>
-        <w:t>System.</w:t>
+        <w:t xml:space="preserve">        System.</w:t>
       </w:r>
       <w:r>
         <w:rPr>
@@ -9494,18 +7958,7 @@
           <w:szCs w:val="20"/>
           <w:lang w:eastAsia="en-IN"/>
         </w:rPr>
-        <w:t>.println</w:t>
-      </w:r>
-      <w:proofErr w:type="spellEnd"/>
-      <w:r>
-        <w:rPr>
-          <w:rFonts w:ascii="Courier New" w:eastAsia="Times New Roman" w:hAnsi="Courier New" w:cs="Courier New"/>
-          <w:color w:val="BCBEC4"/>
-          <w:sz w:val="20"/>
-          <w:szCs w:val="20"/>
-          <w:lang w:eastAsia="en-IN"/>
-        </w:rPr>
-        <w:t>(</w:t>
+        <w:t>.println(</w:t>
       </w:r>
       <w:r>
         <w:rPr>
@@ -9525,18 +7978,7 @@
           <w:szCs w:val="20"/>
           <w:lang w:eastAsia="en-IN"/>
         </w:rPr>
-        <w:t xml:space="preserve">+ </w:t>
-      </w:r>
-      <w:proofErr w:type="spellStart"/>
-      <w:r>
-        <w:rPr>
-          <w:rFonts w:ascii="Courier New" w:eastAsia="Times New Roman" w:hAnsi="Courier New" w:cs="Courier New"/>
-          <w:color w:val="BCBEC4"/>
-          <w:sz w:val="20"/>
-          <w:szCs w:val="20"/>
-          <w:lang w:eastAsia="en-IN"/>
-        </w:rPr>
-        <w:t>Thread.</w:t>
+        <w:t>+ Thread.</w:t>
       </w:r>
       <w:r>
         <w:rPr>
@@ -9550,38 +7992,15 @@
         </w:rPr>
         <w:t>currentThread</w:t>
       </w:r>
-      <w:proofErr w:type="spellEnd"/>
-      <w:r>
-        <w:rPr>
-          <w:rFonts w:ascii="Courier New" w:eastAsia="Times New Roman" w:hAnsi="Courier New" w:cs="Courier New"/>
-          <w:color w:val="BCBEC4"/>
-          <w:sz w:val="20"/>
-          <w:szCs w:val="20"/>
-          <w:lang w:eastAsia="en-IN"/>
-        </w:rPr>
-        <w:t>().</w:t>
-      </w:r>
-      <w:proofErr w:type="spellStart"/>
-      <w:r>
-        <w:rPr>
-          <w:rFonts w:ascii="Courier New" w:eastAsia="Times New Roman" w:hAnsi="Courier New" w:cs="Courier New"/>
-          <w:color w:val="BCBEC4"/>
-          <w:sz w:val="20"/>
-          <w:szCs w:val="20"/>
-          <w:lang w:eastAsia="en-IN"/>
-        </w:rPr>
-        <w:t>getName</w:t>
-      </w:r>
-      <w:proofErr w:type="spellEnd"/>
-      <w:r>
-        <w:rPr>
-          <w:rFonts w:ascii="Courier New" w:eastAsia="Times New Roman" w:hAnsi="Courier New" w:cs="Courier New"/>
-          <w:color w:val="BCBEC4"/>
-          <w:sz w:val="20"/>
-          <w:szCs w:val="20"/>
-          <w:lang w:eastAsia="en-IN"/>
-        </w:rPr>
-        <w:t>());</w:t>
+      <w:r>
+        <w:rPr>
+          <w:rFonts w:ascii="Courier New" w:eastAsia="Times New Roman" w:hAnsi="Courier New" w:cs="Courier New"/>
+          <w:color w:val="BCBEC4"/>
+          <w:sz w:val="20"/>
+          <w:szCs w:val="20"/>
+          <w:lang w:eastAsia="en-IN"/>
+        </w:rPr>
+        <w:t>().getName());</w:t>
       </w:r>
       <w:r>
         <w:rPr>
@@ -9629,49 +8048,15 @@
           <w:lang w:eastAsia="en-IN"/>
         </w:rPr>
       </w:pPr>
-      <w:proofErr w:type="spellStart"/>
-      <w:r>
-        <w:rPr>
-          <w:rFonts w:ascii="Comic Sans MS" w:eastAsia="Times New Roman" w:hAnsi="Comic Sans MS" w:cstheme="majorHAnsi"/>
-          <w:bCs/>
-          <w:sz w:val="24"/>
-          <w:szCs w:val="24"/>
-          <w:lang w:eastAsia="en-IN"/>
-        </w:rPr>
-        <w:t>Ans</w:t>
-      </w:r>
-      <w:proofErr w:type="spellEnd"/>
-      <w:r>
-        <w:rPr>
-          <w:rFonts w:ascii="Comic Sans MS" w:eastAsia="Times New Roman" w:hAnsi="Comic Sans MS" w:cstheme="majorHAnsi"/>
-          <w:bCs/>
-          <w:sz w:val="24"/>
-          <w:szCs w:val="24"/>
-          <w:lang w:eastAsia="en-IN"/>
-        </w:rPr>
-        <w:t xml:space="preserve">: Join stops the execution of thread from which other thread is called. So, here m1 is called from main thread, and on line </w:t>
-      </w:r>
-      <w:proofErr w:type="gramStart"/>
-      <w:r>
-        <w:rPr>
-          <w:rFonts w:ascii="Comic Sans MS" w:eastAsia="Times New Roman" w:hAnsi="Comic Sans MS" w:cstheme="majorHAnsi"/>
-          <w:bCs/>
-          <w:sz w:val="24"/>
-          <w:szCs w:val="24"/>
-          <w:lang w:eastAsia="en-IN"/>
-        </w:rPr>
-        <w:t>m1.join(</w:t>
-      </w:r>
-      <w:proofErr w:type="gramEnd"/>
-      <w:r>
-        <w:rPr>
-          <w:rFonts w:ascii="Comic Sans MS" w:eastAsia="Times New Roman" w:hAnsi="Comic Sans MS" w:cstheme="majorHAnsi"/>
-          <w:bCs/>
-          <w:sz w:val="24"/>
-          <w:szCs w:val="24"/>
-          <w:lang w:eastAsia="en-IN"/>
-        </w:rPr>
-        <w:t>), execution of main thread is paused till m1 executes. So m2 is not started till m1 executes. Later same happens with m2. So first m1 is executed then m2 then last line.</w:t>
+      <w:r>
+        <w:rPr>
+          <w:rFonts w:ascii="Comic Sans MS" w:eastAsia="Times New Roman" w:hAnsi="Comic Sans MS" w:cstheme="majorHAnsi"/>
+          <w:bCs/>
+          <w:sz w:val="24"/>
+          <w:szCs w:val="24"/>
+          <w:lang w:eastAsia="en-IN"/>
+        </w:rPr>
+        <w:t>Ans: Join stops the execution of thread from which other thread is called. So, here m1 is called from main thread, and on line m1.join(), execution of main thread is paused till m1 executes. So m2 is not started till m1 executes. Later same happens with m2. So first m1 is executed then m2 then last line.</w:t>
       </w:r>
     </w:p>
     <w:p>
@@ -10103,27 +8488,15 @@
         </w:rPr>
         <w:t xml:space="preserve">class </w:t>
       </w:r>
-      <w:proofErr w:type="spellStart"/>
-      <w:r>
-        <w:rPr>
-          <w:rFonts w:ascii="Courier New" w:eastAsia="Times New Roman" w:hAnsi="Courier New" w:cs="Courier New"/>
-          <w:color w:val="BCBEC4"/>
-          <w:sz w:val="20"/>
-          <w:szCs w:val="20"/>
-          <w:lang w:eastAsia="en-IN"/>
-        </w:rPr>
-        <w:t>MyThread</w:t>
-      </w:r>
-      <w:proofErr w:type="spellEnd"/>
-      <w:r>
-        <w:rPr>
-          <w:rFonts w:ascii="Courier New" w:eastAsia="Times New Roman" w:hAnsi="Courier New" w:cs="Courier New"/>
-          <w:color w:val="BCBEC4"/>
-          <w:sz w:val="20"/>
-          <w:szCs w:val="20"/>
-          <w:lang w:eastAsia="en-IN"/>
-        </w:rPr>
-        <w:t xml:space="preserve"> </w:t>
+      <w:r>
+        <w:rPr>
+          <w:rFonts w:ascii="Courier New" w:eastAsia="Times New Roman" w:hAnsi="Courier New" w:cs="Courier New"/>
+          <w:color w:val="BCBEC4"/>
+          <w:sz w:val="20"/>
+          <w:szCs w:val="20"/>
+          <w:lang w:eastAsia="en-IN"/>
+        </w:rPr>
+        <w:t xml:space="preserve">MyThread </w:t>
       </w:r>
       <w:r>
         <w:rPr>
@@ -10164,29 +8537,7 @@
           <w:szCs w:val="20"/>
           <w:lang w:eastAsia="en-IN"/>
         </w:rPr>
-        <w:t>//</w:t>
-      </w:r>
-      <w:proofErr w:type="spellStart"/>
-      <w:r>
-        <w:rPr>
-          <w:rFonts w:ascii="Courier New" w:eastAsia="Times New Roman" w:hAnsi="Courier New" w:cs="Courier New"/>
-          <w:color w:val="7A7E85"/>
-          <w:sz w:val="20"/>
-          <w:szCs w:val="20"/>
-          <w:lang w:eastAsia="en-IN"/>
-        </w:rPr>
-        <w:t>thread.start</w:t>
-      </w:r>
-      <w:proofErr w:type="spellEnd"/>
-      <w:r>
-        <w:rPr>
-          <w:rFonts w:ascii="Courier New" w:eastAsia="Times New Roman" w:hAnsi="Courier New" w:cs="Courier New"/>
-          <w:color w:val="7A7E85"/>
-          <w:sz w:val="20"/>
-          <w:szCs w:val="20"/>
-          <w:lang w:eastAsia="en-IN"/>
-        </w:rPr>
-        <w:t xml:space="preserve"> runs run function ( we must override this in our thread class)</w:t>
+        <w:t>//thread.start runs run function ( we must override this in our thread class)</w:t>
       </w:r>
       <w:r>
         <w:rPr>
@@ -10238,18 +8589,7 @@
           <w:lang w:eastAsia="en-IN"/>
         </w:rPr>
         <w:br/>
-        <w:t xml:space="preserve">        </w:t>
-      </w:r>
-      <w:proofErr w:type="spellStart"/>
-      <w:r>
-        <w:rPr>
-          <w:rFonts w:ascii="Courier New" w:eastAsia="Times New Roman" w:hAnsi="Courier New" w:cs="Courier New"/>
-          <w:color w:val="BCBEC4"/>
-          <w:sz w:val="20"/>
-          <w:szCs w:val="20"/>
-          <w:lang w:eastAsia="en-IN"/>
-        </w:rPr>
-        <w:t>System.</w:t>
+        <w:t xml:space="preserve">        System.</w:t>
       </w:r>
       <w:r>
         <w:rPr>
@@ -10271,18 +8611,7 @@
           <w:szCs w:val="20"/>
           <w:lang w:eastAsia="en-IN"/>
         </w:rPr>
-        <w:t>.println</w:t>
-      </w:r>
-      <w:proofErr w:type="spellEnd"/>
-      <w:r>
-        <w:rPr>
-          <w:rFonts w:ascii="Courier New" w:eastAsia="Times New Roman" w:hAnsi="Courier New" w:cs="Courier New"/>
-          <w:color w:val="BCBEC4"/>
-          <w:sz w:val="20"/>
-          <w:szCs w:val="20"/>
-          <w:lang w:eastAsia="en-IN"/>
-        </w:rPr>
-        <w:t>(</w:t>
+        <w:t>.println(</w:t>
       </w:r>
       <w:r>
         <w:rPr>
@@ -10302,18 +8631,7 @@
           <w:szCs w:val="20"/>
           <w:lang w:eastAsia="en-IN"/>
         </w:rPr>
-        <w:t xml:space="preserve">+ </w:t>
-      </w:r>
-      <w:proofErr w:type="spellStart"/>
-      <w:r>
-        <w:rPr>
-          <w:rFonts w:ascii="Courier New" w:eastAsia="Times New Roman" w:hAnsi="Courier New" w:cs="Courier New"/>
-          <w:color w:val="BCBEC4"/>
-          <w:sz w:val="20"/>
-          <w:szCs w:val="20"/>
-          <w:lang w:eastAsia="en-IN"/>
-        </w:rPr>
-        <w:t>Thread.</w:t>
+        <w:t>+ Thread.</w:t>
       </w:r>
       <w:r>
         <w:rPr>
@@ -10327,38 +8645,15 @@
         </w:rPr>
         <w:t>currentThread</w:t>
       </w:r>
-      <w:proofErr w:type="spellEnd"/>
-      <w:r>
-        <w:rPr>
-          <w:rFonts w:ascii="Courier New" w:eastAsia="Times New Roman" w:hAnsi="Courier New" w:cs="Courier New"/>
-          <w:color w:val="BCBEC4"/>
-          <w:sz w:val="20"/>
-          <w:szCs w:val="20"/>
-          <w:lang w:eastAsia="en-IN"/>
-        </w:rPr>
-        <w:t>().</w:t>
-      </w:r>
-      <w:proofErr w:type="spellStart"/>
-      <w:r>
-        <w:rPr>
-          <w:rFonts w:ascii="Courier New" w:eastAsia="Times New Roman" w:hAnsi="Courier New" w:cs="Courier New"/>
-          <w:color w:val="BCBEC4"/>
-          <w:sz w:val="20"/>
-          <w:szCs w:val="20"/>
-          <w:lang w:eastAsia="en-IN"/>
-        </w:rPr>
-        <w:t>getName</w:t>
-      </w:r>
-      <w:proofErr w:type="spellEnd"/>
-      <w:r>
-        <w:rPr>
-          <w:rFonts w:ascii="Courier New" w:eastAsia="Times New Roman" w:hAnsi="Courier New" w:cs="Courier New"/>
-          <w:color w:val="BCBEC4"/>
-          <w:sz w:val="20"/>
-          <w:szCs w:val="20"/>
-          <w:lang w:eastAsia="en-IN"/>
-        </w:rPr>
-        <w:t>());</w:t>
+      <w:r>
+        <w:rPr>
+          <w:rFonts w:ascii="Courier New" w:eastAsia="Times New Roman" w:hAnsi="Courier New" w:cs="Courier New"/>
+          <w:color w:val="BCBEC4"/>
+          <w:sz w:val="20"/>
+          <w:szCs w:val="20"/>
+          <w:lang w:eastAsia="en-IN"/>
+        </w:rPr>
+        <w:t>().getName());</w:t>
       </w:r>
       <w:r>
         <w:rPr>
@@ -10391,7 +8686,6 @@
         </w:rPr>
         <w:t>(</w:t>
       </w:r>
-      <w:proofErr w:type="spellStart"/>
       <w:r>
         <w:rPr>
           <w:rFonts w:ascii="Courier New" w:eastAsia="Times New Roman" w:hAnsi="Courier New" w:cs="Courier New"/>
@@ -10400,40 +8694,17 @@
           <w:szCs w:val="20"/>
           <w:lang w:eastAsia="en-IN"/>
         </w:rPr>
-        <w:t>int</w:t>
-      </w:r>
-      <w:proofErr w:type="spellEnd"/>
-      <w:r>
-        <w:rPr>
-          <w:rFonts w:ascii="Courier New" w:eastAsia="Times New Roman" w:hAnsi="Courier New" w:cs="Courier New"/>
-          <w:color w:val="CF8E6D"/>
-          <w:sz w:val="20"/>
-          <w:szCs w:val="20"/>
-          <w:lang w:eastAsia="en-IN"/>
-        </w:rPr>
-        <w:t xml:space="preserve"> </w:t>
-      </w:r>
-      <w:proofErr w:type="spellStart"/>
-      <w:r>
-        <w:rPr>
-          <w:rFonts w:ascii="Courier New" w:eastAsia="Times New Roman" w:hAnsi="Courier New" w:cs="Courier New"/>
-          <w:color w:val="BCBEC4"/>
-          <w:sz w:val="20"/>
-          <w:szCs w:val="20"/>
-          <w:lang w:eastAsia="en-IN"/>
-        </w:rPr>
-        <w:t>i</w:t>
-      </w:r>
-      <w:proofErr w:type="spellEnd"/>
-      <w:r>
-        <w:rPr>
-          <w:rFonts w:ascii="Courier New" w:eastAsia="Times New Roman" w:hAnsi="Courier New" w:cs="Courier New"/>
-          <w:color w:val="BCBEC4"/>
-          <w:sz w:val="20"/>
-          <w:szCs w:val="20"/>
-          <w:lang w:eastAsia="en-IN"/>
-        </w:rPr>
-        <w:t>=</w:t>
+        <w:t xml:space="preserve">int </w:t>
+      </w:r>
+      <w:r>
+        <w:rPr>
+          <w:rFonts w:ascii="Courier New" w:eastAsia="Times New Roman" w:hAnsi="Courier New" w:cs="Courier New"/>
+          <w:color w:val="BCBEC4"/>
+          <w:sz w:val="20"/>
+          <w:szCs w:val="20"/>
+          <w:lang w:eastAsia="en-IN"/>
+        </w:rPr>
+        <w:t>i=</w:t>
       </w:r>
       <w:r>
         <w:rPr>
@@ -10484,18 +8755,7 @@
           <w:lang w:eastAsia="en-IN"/>
         </w:rPr>
         <w:br/>
-        <w:t xml:space="preserve">            </w:t>
-      </w:r>
-      <w:proofErr w:type="spellStart"/>
-      <w:r>
-        <w:rPr>
-          <w:rFonts w:ascii="Courier New" w:eastAsia="Times New Roman" w:hAnsi="Courier New" w:cs="Courier New"/>
-          <w:color w:val="BCBEC4"/>
-          <w:sz w:val="20"/>
-          <w:szCs w:val="20"/>
-          <w:lang w:eastAsia="en-IN"/>
-        </w:rPr>
-        <w:t>System.</w:t>
+        <w:t xml:space="preserve">            System.</w:t>
       </w:r>
       <w:r>
         <w:rPr>
@@ -10517,40 +8777,7 @@
           <w:szCs w:val="20"/>
           <w:lang w:eastAsia="en-IN"/>
         </w:rPr>
-        <w:t>.println</w:t>
-      </w:r>
-      <w:proofErr w:type="spellEnd"/>
-      <w:r>
-        <w:rPr>
-          <w:rFonts w:ascii="Courier New" w:eastAsia="Times New Roman" w:hAnsi="Courier New" w:cs="Courier New"/>
-          <w:color w:val="BCBEC4"/>
-          <w:sz w:val="20"/>
-          <w:szCs w:val="20"/>
-          <w:lang w:eastAsia="en-IN"/>
-        </w:rPr>
-        <w:t>(</w:t>
-      </w:r>
-      <w:proofErr w:type="spellStart"/>
-      <w:r>
-        <w:rPr>
-          <w:rFonts w:ascii="Courier New" w:eastAsia="Times New Roman" w:hAnsi="Courier New" w:cs="Courier New"/>
-          <w:color w:val="BCBEC4"/>
-          <w:sz w:val="20"/>
-          <w:szCs w:val="20"/>
-          <w:lang w:eastAsia="en-IN"/>
-        </w:rPr>
-        <w:t>i</w:t>
-      </w:r>
-      <w:proofErr w:type="spellEnd"/>
-      <w:r>
-        <w:rPr>
-          <w:rFonts w:ascii="Courier New" w:eastAsia="Times New Roman" w:hAnsi="Courier New" w:cs="Courier New"/>
-          <w:color w:val="BCBEC4"/>
-          <w:sz w:val="20"/>
-          <w:szCs w:val="20"/>
-          <w:lang w:eastAsia="en-IN"/>
-        </w:rPr>
-        <w:t xml:space="preserve"> + </w:t>
+        <w:t xml:space="preserve">.println(i + </w:t>
       </w:r>
       <w:r>
         <w:rPr>
@@ -10570,18 +8797,7 @@
           <w:szCs w:val="20"/>
           <w:lang w:eastAsia="en-IN"/>
         </w:rPr>
-        <w:t xml:space="preserve">+ </w:t>
-      </w:r>
-      <w:proofErr w:type="spellStart"/>
-      <w:r>
-        <w:rPr>
-          <w:rFonts w:ascii="Courier New" w:eastAsia="Times New Roman" w:hAnsi="Courier New" w:cs="Courier New"/>
-          <w:color w:val="BCBEC4"/>
-          <w:sz w:val="20"/>
-          <w:szCs w:val="20"/>
-          <w:lang w:eastAsia="en-IN"/>
-        </w:rPr>
-        <w:t>Thread.</w:t>
+        <w:t>+ Thread.</w:t>
       </w:r>
       <w:r>
         <w:rPr>
@@ -10595,38 +8811,15 @@
         </w:rPr>
         <w:t>currentThread</w:t>
       </w:r>
-      <w:proofErr w:type="spellEnd"/>
-      <w:r>
-        <w:rPr>
-          <w:rFonts w:ascii="Courier New" w:eastAsia="Times New Roman" w:hAnsi="Courier New" w:cs="Courier New"/>
-          <w:color w:val="BCBEC4"/>
-          <w:sz w:val="20"/>
-          <w:szCs w:val="20"/>
-          <w:lang w:eastAsia="en-IN"/>
-        </w:rPr>
-        <w:t>().</w:t>
-      </w:r>
-      <w:proofErr w:type="spellStart"/>
-      <w:r>
-        <w:rPr>
-          <w:rFonts w:ascii="Courier New" w:eastAsia="Times New Roman" w:hAnsi="Courier New" w:cs="Courier New"/>
-          <w:color w:val="BCBEC4"/>
-          <w:sz w:val="20"/>
-          <w:szCs w:val="20"/>
-          <w:lang w:eastAsia="en-IN"/>
-        </w:rPr>
-        <w:t>getName</w:t>
-      </w:r>
-      <w:proofErr w:type="spellEnd"/>
-      <w:r>
-        <w:rPr>
-          <w:rFonts w:ascii="Courier New" w:eastAsia="Times New Roman" w:hAnsi="Courier New" w:cs="Courier New"/>
-          <w:color w:val="BCBEC4"/>
-          <w:sz w:val="20"/>
-          <w:szCs w:val="20"/>
-          <w:lang w:eastAsia="en-IN"/>
-        </w:rPr>
-        <w:t>());</w:t>
+      <w:r>
+        <w:rPr>
+          <w:rFonts w:ascii="Courier New" w:eastAsia="Times New Roman" w:hAnsi="Courier New" w:cs="Courier New"/>
+          <w:color w:val="BCBEC4"/>
+          <w:sz w:val="20"/>
+          <w:szCs w:val="20"/>
+          <w:lang w:eastAsia="en-IN"/>
+        </w:rPr>
+        <w:t>().getName());</w:t>
       </w:r>
       <w:r>
         <w:rPr>
@@ -10691,27 +8884,15 @@
         </w:rPr>
         <w:t xml:space="preserve">class </w:t>
       </w:r>
-      <w:proofErr w:type="spellStart"/>
-      <w:r>
-        <w:rPr>
-          <w:rFonts w:ascii="Courier New" w:eastAsia="Times New Roman" w:hAnsi="Courier New" w:cs="Courier New"/>
-          <w:color w:val="BCBEC4"/>
-          <w:sz w:val="20"/>
-          <w:szCs w:val="20"/>
-          <w:lang w:eastAsia="en-IN"/>
-        </w:rPr>
-        <w:t>LearnThread</w:t>
-      </w:r>
-      <w:proofErr w:type="spellEnd"/>
-      <w:r>
-        <w:rPr>
-          <w:rFonts w:ascii="Courier New" w:eastAsia="Times New Roman" w:hAnsi="Courier New" w:cs="Courier New"/>
-          <w:color w:val="BCBEC4"/>
-          <w:sz w:val="20"/>
-          <w:szCs w:val="20"/>
-          <w:lang w:eastAsia="en-IN"/>
-        </w:rPr>
-        <w:t>{</w:t>
+      <w:r>
+        <w:rPr>
+          <w:rFonts w:ascii="Courier New" w:eastAsia="Times New Roman" w:hAnsi="Courier New" w:cs="Courier New"/>
+          <w:color w:val="BCBEC4"/>
+          <w:sz w:val="20"/>
+          <w:szCs w:val="20"/>
+          <w:lang w:eastAsia="en-IN"/>
+        </w:rPr>
+        <w:t>LearnThread{</w:t>
       </w:r>
       <w:r>
         <w:rPr>
@@ -10752,29 +8933,7 @@
           <w:szCs w:val="20"/>
           <w:lang w:eastAsia="en-IN"/>
         </w:rPr>
-        <w:t xml:space="preserve">(String[] </w:t>
-      </w:r>
-      <w:proofErr w:type="spellStart"/>
-      <w:r>
-        <w:rPr>
-          <w:rFonts w:ascii="Courier New" w:eastAsia="Times New Roman" w:hAnsi="Courier New" w:cs="Courier New"/>
-          <w:color w:val="BCBEC4"/>
-          <w:sz w:val="20"/>
-          <w:szCs w:val="20"/>
-          <w:lang w:eastAsia="en-IN"/>
-        </w:rPr>
-        <w:t>args</w:t>
-      </w:r>
-      <w:proofErr w:type="spellEnd"/>
-      <w:r>
-        <w:rPr>
-          <w:rFonts w:ascii="Courier New" w:eastAsia="Times New Roman" w:hAnsi="Courier New" w:cs="Courier New"/>
-          <w:color w:val="BCBEC4"/>
-          <w:sz w:val="20"/>
-          <w:szCs w:val="20"/>
-          <w:lang w:eastAsia="en-IN"/>
-        </w:rPr>
-        <w:t xml:space="preserve">) </w:t>
+        <w:t xml:space="preserve">(String[] args) </w:t>
       </w:r>
       <w:r>
         <w:rPr>
@@ -10786,27 +8945,15 @@
         </w:rPr>
         <w:t xml:space="preserve">throws </w:t>
       </w:r>
-      <w:proofErr w:type="spellStart"/>
-      <w:r>
-        <w:rPr>
-          <w:rFonts w:ascii="Courier New" w:eastAsia="Times New Roman" w:hAnsi="Courier New" w:cs="Courier New"/>
-          <w:color w:val="BCBEC4"/>
-          <w:sz w:val="20"/>
-          <w:szCs w:val="20"/>
-          <w:lang w:eastAsia="en-IN"/>
-        </w:rPr>
-        <w:t>InterruptedException</w:t>
-      </w:r>
-      <w:proofErr w:type="spellEnd"/>
-      <w:r>
-        <w:rPr>
-          <w:rFonts w:ascii="Courier New" w:eastAsia="Times New Roman" w:hAnsi="Courier New" w:cs="Courier New"/>
-          <w:color w:val="BCBEC4"/>
-          <w:sz w:val="20"/>
-          <w:szCs w:val="20"/>
-          <w:lang w:eastAsia="en-IN"/>
-        </w:rPr>
-        <w:t xml:space="preserve"> {</w:t>
+      <w:r>
+        <w:rPr>
+          <w:rFonts w:ascii="Courier New" w:eastAsia="Times New Roman" w:hAnsi="Courier New" w:cs="Courier New"/>
+          <w:color w:val="BCBEC4"/>
+          <w:sz w:val="20"/>
+          <w:szCs w:val="20"/>
+          <w:lang w:eastAsia="en-IN"/>
+        </w:rPr>
+        <w:t>InterruptedException {</w:t>
       </w:r>
       <w:r>
         <w:rPr>
@@ -10817,29 +8964,7 @@
           <w:lang w:eastAsia="en-IN"/>
         </w:rPr>
         <w:br/>
-        <w:t xml:space="preserve">        </w:t>
-      </w:r>
-      <w:proofErr w:type="spellStart"/>
-      <w:r>
-        <w:rPr>
-          <w:rFonts w:ascii="Courier New" w:eastAsia="Times New Roman" w:hAnsi="Courier New" w:cs="Courier New"/>
-          <w:color w:val="BCBEC4"/>
-          <w:sz w:val="20"/>
-          <w:szCs w:val="20"/>
-          <w:lang w:eastAsia="en-IN"/>
-        </w:rPr>
-        <w:t>MyThread</w:t>
-      </w:r>
-      <w:proofErr w:type="spellEnd"/>
-      <w:r>
-        <w:rPr>
-          <w:rFonts w:ascii="Courier New" w:eastAsia="Times New Roman" w:hAnsi="Courier New" w:cs="Courier New"/>
-          <w:color w:val="BCBEC4"/>
-          <w:sz w:val="20"/>
-          <w:szCs w:val="20"/>
-          <w:lang w:eastAsia="en-IN"/>
-        </w:rPr>
-        <w:t xml:space="preserve"> m1 = </w:t>
+        <w:t xml:space="preserve">        MyThread m1 = </w:t>
       </w:r>
       <w:r>
         <w:rPr>
@@ -10851,27 +8976,15 @@
         </w:rPr>
         <w:t xml:space="preserve">new </w:t>
       </w:r>
-      <w:proofErr w:type="spellStart"/>
-      <w:r>
-        <w:rPr>
-          <w:rFonts w:ascii="Courier New" w:eastAsia="Times New Roman" w:hAnsi="Courier New" w:cs="Courier New"/>
-          <w:color w:val="BCBEC4"/>
-          <w:sz w:val="20"/>
-          <w:szCs w:val="20"/>
-          <w:lang w:eastAsia="en-IN"/>
-        </w:rPr>
-        <w:t>MyThread</w:t>
-      </w:r>
-      <w:proofErr w:type="spellEnd"/>
-      <w:r>
-        <w:rPr>
-          <w:rFonts w:ascii="Courier New" w:eastAsia="Times New Roman" w:hAnsi="Courier New" w:cs="Courier New"/>
-          <w:color w:val="BCBEC4"/>
-          <w:sz w:val="20"/>
-          <w:szCs w:val="20"/>
-          <w:lang w:eastAsia="en-IN"/>
-        </w:rPr>
-        <w:t>();</w:t>
+      <w:r>
+        <w:rPr>
+          <w:rFonts w:ascii="Courier New" w:eastAsia="Times New Roman" w:hAnsi="Courier New" w:cs="Courier New"/>
+          <w:color w:val="BCBEC4"/>
+          <w:sz w:val="20"/>
+          <w:szCs w:val="20"/>
+          <w:lang w:eastAsia="en-IN"/>
+        </w:rPr>
+        <w:t>MyThread();</w:t>
       </w:r>
       <w:r>
         <w:rPr>
@@ -10882,29 +8995,7 @@
           <w:lang w:eastAsia="en-IN"/>
         </w:rPr>
         <w:br/>
-        <w:t xml:space="preserve">        </w:t>
-      </w:r>
-      <w:proofErr w:type="spellStart"/>
-      <w:r>
-        <w:rPr>
-          <w:rFonts w:ascii="Courier New" w:eastAsia="Times New Roman" w:hAnsi="Courier New" w:cs="Courier New"/>
-          <w:color w:val="BCBEC4"/>
-          <w:sz w:val="20"/>
-          <w:szCs w:val="20"/>
-          <w:lang w:eastAsia="en-IN"/>
-        </w:rPr>
-        <w:t>MyThread</w:t>
-      </w:r>
-      <w:proofErr w:type="spellEnd"/>
-      <w:r>
-        <w:rPr>
-          <w:rFonts w:ascii="Courier New" w:eastAsia="Times New Roman" w:hAnsi="Courier New" w:cs="Courier New"/>
-          <w:color w:val="BCBEC4"/>
-          <w:sz w:val="20"/>
-          <w:szCs w:val="20"/>
-          <w:lang w:eastAsia="en-IN"/>
-        </w:rPr>
-        <w:t xml:space="preserve"> m2 = </w:t>
+        <w:t xml:space="preserve">        MyThread m2 = </w:t>
       </w:r>
       <w:r>
         <w:rPr>
@@ -10916,27 +9007,15 @@
         </w:rPr>
         <w:t xml:space="preserve">new </w:t>
       </w:r>
-      <w:proofErr w:type="spellStart"/>
-      <w:r>
-        <w:rPr>
-          <w:rFonts w:ascii="Courier New" w:eastAsia="Times New Roman" w:hAnsi="Courier New" w:cs="Courier New"/>
-          <w:color w:val="BCBEC4"/>
-          <w:sz w:val="20"/>
-          <w:szCs w:val="20"/>
-          <w:lang w:eastAsia="en-IN"/>
-        </w:rPr>
-        <w:t>MyThread</w:t>
-      </w:r>
-      <w:proofErr w:type="spellEnd"/>
-      <w:r>
-        <w:rPr>
-          <w:rFonts w:ascii="Courier New" w:eastAsia="Times New Roman" w:hAnsi="Courier New" w:cs="Courier New"/>
-          <w:color w:val="BCBEC4"/>
-          <w:sz w:val="20"/>
-          <w:szCs w:val="20"/>
-          <w:lang w:eastAsia="en-IN"/>
-        </w:rPr>
-        <w:t>();</w:t>
+      <w:r>
+        <w:rPr>
+          <w:rFonts w:ascii="Courier New" w:eastAsia="Times New Roman" w:hAnsi="Courier New" w:cs="Courier New"/>
+          <w:color w:val="BCBEC4"/>
+          <w:sz w:val="20"/>
+          <w:szCs w:val="20"/>
+          <w:lang w:eastAsia="en-IN"/>
+        </w:rPr>
+        <w:t>MyThread();</w:t>
       </w:r>
       <w:r>
         <w:rPr>
@@ -11011,18 +9090,7 @@
           <w:lang w:eastAsia="en-IN"/>
         </w:rPr>
         <w:br/>
-        <w:t xml:space="preserve">        </w:t>
-      </w:r>
-      <w:proofErr w:type="spellStart"/>
-      <w:r>
-        <w:rPr>
-          <w:rFonts w:ascii="Courier New" w:eastAsia="Times New Roman" w:hAnsi="Courier New" w:cs="Courier New"/>
-          <w:color w:val="BCBEC4"/>
-          <w:sz w:val="20"/>
-          <w:szCs w:val="20"/>
-          <w:lang w:eastAsia="en-IN"/>
-        </w:rPr>
-        <w:t>System.</w:t>
+        <w:t xml:space="preserve">        System.</w:t>
       </w:r>
       <w:r>
         <w:rPr>
@@ -11044,18 +9112,7 @@
           <w:szCs w:val="20"/>
           <w:lang w:eastAsia="en-IN"/>
         </w:rPr>
-        <w:t>.println</w:t>
-      </w:r>
-      <w:proofErr w:type="spellEnd"/>
-      <w:r>
-        <w:rPr>
-          <w:rFonts w:ascii="Courier New" w:eastAsia="Times New Roman" w:hAnsi="Courier New" w:cs="Courier New"/>
-          <w:color w:val="BCBEC4"/>
-          <w:sz w:val="20"/>
-          <w:szCs w:val="20"/>
-          <w:lang w:eastAsia="en-IN"/>
-        </w:rPr>
-        <w:t>(</w:t>
+        <w:t>.println(</w:t>
       </w:r>
       <w:r>
         <w:rPr>
@@ -11075,18 +9132,7 @@
           <w:szCs w:val="20"/>
           <w:lang w:eastAsia="en-IN"/>
         </w:rPr>
-        <w:t xml:space="preserve">+ </w:t>
-      </w:r>
-      <w:proofErr w:type="spellStart"/>
-      <w:r>
-        <w:rPr>
-          <w:rFonts w:ascii="Courier New" w:eastAsia="Times New Roman" w:hAnsi="Courier New" w:cs="Courier New"/>
-          <w:color w:val="BCBEC4"/>
-          <w:sz w:val="20"/>
-          <w:szCs w:val="20"/>
-          <w:lang w:eastAsia="en-IN"/>
-        </w:rPr>
-        <w:t>Thread.</w:t>
+        <w:t>+ Thread.</w:t>
       </w:r>
       <w:r>
         <w:rPr>
@@ -11100,38 +9146,15 @@
         </w:rPr>
         <w:t>currentThread</w:t>
       </w:r>
-      <w:proofErr w:type="spellEnd"/>
-      <w:r>
-        <w:rPr>
-          <w:rFonts w:ascii="Courier New" w:eastAsia="Times New Roman" w:hAnsi="Courier New" w:cs="Courier New"/>
-          <w:color w:val="BCBEC4"/>
-          <w:sz w:val="20"/>
-          <w:szCs w:val="20"/>
-          <w:lang w:eastAsia="en-IN"/>
-        </w:rPr>
-        <w:t>().</w:t>
-      </w:r>
-      <w:proofErr w:type="spellStart"/>
-      <w:r>
-        <w:rPr>
-          <w:rFonts w:ascii="Courier New" w:eastAsia="Times New Roman" w:hAnsi="Courier New" w:cs="Courier New"/>
-          <w:color w:val="BCBEC4"/>
-          <w:sz w:val="20"/>
-          <w:szCs w:val="20"/>
-          <w:lang w:eastAsia="en-IN"/>
-        </w:rPr>
-        <w:t>getName</w:t>
-      </w:r>
-      <w:proofErr w:type="spellEnd"/>
-      <w:r>
-        <w:rPr>
-          <w:rFonts w:ascii="Courier New" w:eastAsia="Times New Roman" w:hAnsi="Courier New" w:cs="Courier New"/>
-          <w:color w:val="BCBEC4"/>
-          <w:sz w:val="20"/>
-          <w:szCs w:val="20"/>
-          <w:lang w:eastAsia="en-IN"/>
-        </w:rPr>
-        <w:t>());</w:t>
+      <w:r>
+        <w:rPr>
+          <w:rFonts w:ascii="Courier New" w:eastAsia="Times New Roman" w:hAnsi="Courier New" w:cs="Courier New"/>
+          <w:color w:val="BCBEC4"/>
+          <w:sz w:val="20"/>
+          <w:szCs w:val="20"/>
+          <w:lang w:eastAsia="en-IN"/>
+        </w:rPr>
+        <w:t>().getName());</w:t>
       </w:r>
       <w:r>
         <w:rPr>
@@ -11210,37 +9233,15 @@
           <w:lang w:eastAsia="en-IN"/>
         </w:rPr>
       </w:pPr>
-      <w:proofErr w:type="spellStart"/>
-      <w:r>
-        <w:rPr>
-          <w:rFonts w:ascii="Comic Sans MS" w:eastAsia="Times New Roman" w:hAnsi="Comic Sans MS" w:cstheme="majorHAnsi"/>
-          <w:bCs/>
-          <w:sz w:val="24"/>
-          <w:szCs w:val="24"/>
-          <w:lang w:eastAsia="en-IN"/>
-        </w:rPr>
-        <w:t>Ans</w:t>
-      </w:r>
-      <w:proofErr w:type="spellEnd"/>
-      <w:r>
-        <w:rPr>
-          <w:rFonts w:ascii="Comic Sans MS" w:eastAsia="Times New Roman" w:hAnsi="Comic Sans MS" w:cstheme="majorHAnsi"/>
-          <w:bCs/>
-          <w:sz w:val="24"/>
-          <w:szCs w:val="24"/>
-          <w:lang w:eastAsia="en-IN"/>
-        </w:rPr>
-        <w:t xml:space="preserve">: </w:t>
-      </w:r>
-      <w:r>
-        <w:rPr>
-          <w:rFonts w:ascii="Comic Sans MS" w:eastAsia="Times New Roman" w:hAnsi="Comic Sans MS" w:cstheme="majorHAnsi"/>
-          <w:bCs/>
-          <w:sz w:val="24"/>
-          <w:szCs w:val="24"/>
-          <w:lang w:eastAsia="en-IN"/>
-        </w:rPr>
-        <w:t>join is written after m1 and m2 started. So output from m1 and m2 combines and at end main thread runs</w:t>
+      <w:r>
+        <w:rPr>
+          <w:rFonts w:ascii="Comic Sans MS" w:eastAsia="Times New Roman" w:hAnsi="Comic Sans MS" w:cstheme="majorHAnsi"/>
+          <w:bCs/>
+          <w:sz w:val="24"/>
+          <w:szCs w:val="24"/>
+          <w:lang w:eastAsia="en-IN"/>
+        </w:rPr>
+        <w:t>Ans: join is written after m1 and m2 started. So output from m1 and m2 combines and at end main thread runs</w:t>
       </w:r>
     </w:p>
     <w:p>
@@ -11644,7 +9645,7 @@
         <w:noProof/>
         <w:color w:val="4472C4" w:themeColor="accent1"/>
       </w:rPr>
-      <w:t>1</w:t>
+      <w:t>6</w:t>
     </w:r>
     <w:r>
       <w:rPr>
@@ -14776,6 +12777,7 @@
   <w:style w:type="character" w:default="1" w:styleId="DefaultParagraphFont">
     <w:name w:val="Default Paragraph Font"/>
     <w:uiPriority w:val="1"/>
+    <w:semiHidden/>
     <w:unhideWhenUsed/>
   </w:style>
   <w:style w:type="table" w:default="1" w:styleId="TableNormal">
@@ -15496,7 +13498,7 @@
 </file>
 
 <file path=customXml/itemProps1.xml><?xml version="1.0" encoding="utf-8"?>
-<ds:datastoreItem xmlns:ds="http://schemas.openxmlformats.org/officeDocument/2006/customXml" ds:itemID="{5E6AFC6B-4AD2-45D9-82E3-C18EE3AE574D}">
+<ds:datastoreItem xmlns:ds="http://schemas.openxmlformats.org/officeDocument/2006/customXml" ds:itemID="{0AE15B87-0A69-4EF9-9E4E-0863392EEF71}">
   <ds:schemaRefs>
     <ds:schemaRef ds:uri="http://schemas.openxmlformats.org/officeDocument/2006/bibliography"/>
   </ds:schemaRefs>

</xml_diff>